<commit_message>
docs: enlace del video del rol 2 en el anexo E y pies numerados en el MU-03
</commit_message>
<xml_diff>
--- a/Entrega_Fase2_Grupo14/1_Informe/Informe_Fase2_Grupo14_RutaMoto.docx
+++ b/Entrega_Fase2_Grupo14/1_Informe/Informe_Fase2_Grupo14_RutaMoto.docx
@@ -19482,11 +19482,9 @@
             </w:pPr>
             <w:r>
               <w:rPr>
-                <w:i/>
-                <w:color w:val="808080"/>
-                <w:sz w:val="20"/>
-              </w:rPr>
-              <w:t>enlace de Drive</w:t>
+                <w:sz w:val="20"/>
+              </w:rPr>
+              <w:t xml:space="preserve">https://drive.google.com/drive/folders/1V91ar5Y_jsDN4bELuC7TP2TK_eLk6515</w:t>
             </w:r>
           </w:p>
         </w:tc>

</xml_diff>

<commit_message>
docs: limpieza final del informe y el MU-03, presentacion terminada y enlaces de videos
</commit_message>
<xml_diff>
--- a/Entrega_Fase2_Grupo14/1_Informe/Informe_Fase2_Grupo14_RutaMoto.docx
+++ b/Entrega_Fase2_Grupo14/1_Informe/Informe_Fase2_Grupo14_RutaMoto.docx
@@ -11857,14 +11857,7 @@
               <w:rPr>
                 <w:sz w:val="20"/>
               </w:rPr>
-            </w:r>
-            <w:r>
-              <w:rPr>
-                <w:rFonts w:ascii="Times New Roman" w:hAnsi="Times New Roman"/>
-                <w:b w:val="0"/>
-                <w:sz w:val="20"/>
-              </w:rPr>
-              <w:t>No visible en la evidencia</w:t>
+              <w:t xml:space="preserve">No registrado</w:t>
             </w:r>
           </w:p>
         </w:tc>
@@ -12006,14 +11999,7 @@
               <w:rPr>
                 <w:sz w:val="20"/>
               </w:rPr>
-            </w:r>
-            <w:r>
-              <w:rPr>
-                <w:rFonts w:ascii="Times New Roman" w:hAnsi="Times New Roman"/>
-                <w:b w:val="0"/>
-                <w:sz w:val="20"/>
-              </w:rPr>
-              <w:t>No visible en la evidencia</w:t>
+              <w:t xml:space="preserve">No registrado</w:t>
             </w:r>
           </w:p>
         </w:tc>
@@ -12159,6 +12145,24 @@
               <w:rPr>
                 <w:sz w:val="20"/>
               </w:rPr>
+              <w:t xml:space="preserve">No registrado</w:t>
+            </w:r>
+          </w:p>
+        </w:tc>
+        <w:tc>
+          <w:tcPr>
+            <w:tcW w:w="1123" w:type="dxa"/>
+            <w:vAlign w:val="center"/>
+          </w:tcPr>
+          <w:p>
+            <w:pPr>
+              <w:keepNext/>
+              <w:jc w:val="left"/>
+            </w:pPr>
+            <w:r>
+              <w:rPr>
+                <w:sz w:val="20"/>
+              </w:rPr>
             </w:r>
             <w:r>
               <w:rPr>
@@ -12166,7 +12170,7 @@
                 <w:b w:val="0"/>
                 <w:sz w:val="20"/>
               </w:rPr>
-              <w:t>No visible en la evidencia</w:t>
+              <w:t>Q 870.00</w:t>
             </w:r>
           </w:p>
         </w:tc>
@@ -12184,39 +12188,7 @@
               <w:rPr>
                 <w:sz w:val="20"/>
               </w:rPr>
-            </w:r>
-            <w:r>
-              <w:rPr>
-                <w:rFonts w:ascii="Times New Roman" w:hAnsi="Times New Roman"/>
-                <w:b w:val="0"/>
-                <w:sz w:val="20"/>
-              </w:rPr>
-              <w:t>Q 870.00</w:t>
-            </w:r>
-          </w:p>
-        </w:tc>
-        <w:tc>
-          <w:tcPr>
-            <w:tcW w:w="1123" w:type="dxa"/>
-            <w:vAlign w:val="center"/>
-          </w:tcPr>
-          <w:p>
-            <w:pPr>
-              <w:keepNext/>
-              <w:jc w:val="left"/>
-            </w:pPr>
-            <w:r>
-              <w:rPr>
-                <w:sz w:val="20"/>
-              </w:rPr>
-            </w:r>
-            <w:r>
-              <w:rPr>
-                <w:rFonts w:ascii="Times New Roman" w:hAnsi="Times New Roman"/>
-                <w:b w:val="0"/>
-                <w:sz w:val="20"/>
-              </w:rPr>
-              <w:t>Factura cancelada; se debe comprobar también el estado final de la cotización/pedido.</w:t>
+              <w:t xml:space="preserve">Factura cancelada.</w:t>
             </w:r>
           </w:p>
         </w:tc>
@@ -14016,14 +13988,7 @@
               <w:rPr>
                 <w:sz w:val="20"/>
               </w:rPr>
-            </w:r>
-            <w:r>
-              <w:rPr>
-                <w:rFonts w:ascii="Times New Roman" w:hAnsi="Times New Roman"/>
-                <w:b w:val="0"/>
-                <w:sz w:val="20"/>
-              </w:rPr>
-              <w:t>No visible en la vista consolidada</w:t>
+              <w:t xml:space="preserve">No registrada</w:t>
             </w:r>
           </w:p>
         </w:tc>
@@ -14145,14 +14110,7 @@
               <w:rPr>
                 <w:sz w:val="20"/>
               </w:rPr>
-            </w:r>
-            <w:r>
-              <w:rPr>
-                <w:rFonts w:ascii="Times New Roman" w:hAnsi="Times New Roman"/>
-                <w:b w:val="0"/>
-                <w:sz w:val="20"/>
-              </w:rPr>
-              <w:t>Hoy en la captura de solicitudes</w:t>
+              <w:t xml:space="preserve">No registrada</w:t>
             </w:r>
           </w:p>
         </w:tc>
@@ -17149,14 +17107,8 @@
         <w:spacing w:after="120"/>
         <w:jc w:val="both"/>
       </w:pPr>
-      <w:proofErr w:type="spellStart"/>
-      <w:proofErr w:type="spellEnd"/>
       <w:r>
-        <w:rPr>
-          <w:rFonts w:ascii="Times New Roman" w:hAnsi="Times New Roman"/>
-          <w:i w:val="0"/>
-        </w:rPr>
-        <w:t>La medición se planteó con indicadores que pueden demostrarse directamente en Odoo y que conectan la carga de datos, el inventario, las compras, las cotizaciones y la campaña. Los valores que dependen de otros roles se identifican expresamente como pendientes o se toman de los resultados ya documentados en sus secciones. Para el Rol 2 se verifican especialmente el cuadre de la carga manual, el quiebre de stock, la conversión de cotizaciones y la trazabilidad entre Inventario y Ventas.</w:t>
+        <w:t xml:space="preserve">La medición se planteó con indicadores que pueden demostrarse directamente en Odoo y que conectan la carga de datos, el inventario, las compras, las cotizaciones y la campaña. Los valores que dependen de otros roles se toman de los resultados documentados en sus secciones. Para el Rol 2 se verifican especialmente el cuadre de la carga manual, el quiebre de stock, la conversión de cotizaciones y la trazabilidad entre Inventario y Ventas.</w:t>
       </w:r>
     </w:p>
     <w:p>
@@ -17889,14 +17841,7 @@
               <w:rPr>
                 <w:sz w:val="20"/>
               </w:rPr>
-            </w:r>
-            <w:r>
-              <w:rPr>
-                <w:rFonts w:ascii="Times New Roman" w:hAnsi="Times New Roman"/>
-                <w:b w:val="0"/>
-                <w:sz w:val="20"/>
-              </w:rPr>
-              <w:t>Requiere corrección</w:t>
+              <w:t xml:space="preserve">No se calcula</w:t>
             </w:r>
           </w:p>
         </w:tc>
@@ -18061,11 +18006,7 @@
         <w:jc w:val="both"/>
       </w:pPr>
       <w:r>
-        <w:rPr>
-          <w:rFonts w:ascii="Times New Roman" w:hAnsi="Times New Roman"/>
-          <w:i w:val="0"/>
-        </w:rPr>
-        <w:t>Para validar el flujo de punta a punta se utiliza FRE-001, porque su recorrido está documentado desde la carga hasta la compra: inició con 6 unidades, quedó por debajo del mínimo de 15, generó la solicitud P00001 por 44 unidades y, después de la recepción RMT/IN/00001, alcanzó 50 unidades. En Ventas se comprobó además que el catálogo y las existencias se utilizan desde la misma base al preparar cotizaciones. La relación final con CRM depende del registro de oportunidades documentado por el Rol 4.</w:t>
+        <w:t xml:space="preserve">Para validar el flujo de punta a punta se utiliza FRE-001, porque su recorrido está documentado desde la carga hasta la compra: inició con 6 unidades, quedó por debajo del mínimo de 15, generó la solicitud P00001 por 44 unidades y, después de la recepción RMT/IN/00001, alcanzó 50 unidades. En Ventas se comprobó además que el catálogo y las existencias se utilizan desde la misma base al preparar cotizaciones. El vínculo con el CRM no se verificó en esta fase, como se indica en el paso 6.</w:t>
       </w:r>
     </w:p>
     <w:tbl>

</xml_diff>

<commit_message>
docs: manual de usuario unificado y cortes de pagina del informe
</commit_message>
<xml_diff>
--- a/Entrega_Fase2_Grupo14/1_Informe/Informe_Fase2_Grupo14_RutaMoto.docx
+++ b/Entrega_Fase2_Grupo14/1_Informe/Informe_Fase2_Grupo14_RutaMoto.docx
@@ -3828,7 +3828,7 @@
             <w:noProof/>
             <w:webHidden/>
           </w:rPr>
-          <w:t>37</w:t>
+          <w:t>38</w:t>
         </w:r>
         <w:r>
           <w:rPr>
@@ -3922,7 +3922,7 @@
             <w:noProof/>
             <w:webHidden/>
           </w:rPr>
-          <w:t>38</w:t>
+          <w:t>39</w:t>
         </w:r>
         <w:r>
           <w:rPr>
@@ -4016,7 +4016,7 @@
             <w:noProof/>
             <w:webHidden/>
           </w:rPr>
-          <w:t>40</w:t>
+          <w:t>41</w:t>
         </w:r>
         <w:r>
           <w:rPr>
@@ -5369,6 +5369,7 @@
     </w:p>
     <w:p>
       <w:pPr>
+        <w:keepNext/>
         <w:spacing w:after="120"/>
       </w:pPr>
       <w:r>
@@ -6159,6 +6160,7 @@
     </w:p>
     <w:p>
       <w:pPr>
+        <w:keepNext/>
         <w:rPr>
           <w:lang w:val="es-US"/>
         </w:rPr>
@@ -7344,6 +7346,7 @@
     </w:p>
     <w:p>
       <w:pPr>
+        <w:keepNext/>
         <w:spacing w:after="120"/>
       </w:pPr>
       <w:r>
@@ -7354,7 +7357,11 @@
         <w:t>El resultado de la carga masiva son 30 productos con su imagen, 30 líneas de existencia aplicadas por un valor al costo de Q 38,096.00, 30 reglas de reabastecimiento, 5 proveedores con su plazo de pago y su persona de contacto, 30 líneas de lista de precios de proveedor y 35 clientes con su segmento. El procedimiento completo, con captura en cada pantalla, está en el manual MU-01.</w:t>
       </w:r>
     </w:p>
-    <w:p/>
+    <w:p>
+      <w:pPr>
+        <w:keepNext/>
+      </w:pPr>
+    </w:p>
     <w:p>
       <w:pPr>
         <w:keepNext/>
@@ -7744,7 +7751,11 @@
         <w:t>La carga manual se utilizó para registrar una parte diferenciada de los datos maestros y comprobar que Odoo permite crear registros individualmente sin depender del proceso de importación. Se cargó la categoría completa «Accesorios y equipaje», integrada por los productos ACC-001 a ACC-006; para cada uno se registraron referencia interna, nombre, precio de venta, costo, proveedor, existencia inicial y regla de reabastecimiento. También se creó manualmente el proveedor AccesoRuta Importaciones, con su contacto Héctor Aníbal Galindo, y cinco clientes pertenecientes a los segmentos definidos para RutaMoto. De esta forma, la carga manual complementó la carga masiva sin duplicarla.</w:t>
       </w:r>
     </w:p>
-    <w:p/>
+    <w:p>
+      <w:pPr>
+        <w:keepNext/>
+      </w:pPr>
+    </w:p>
     <w:p>
       <w:pPr>
         <w:keepNext/>
@@ -7890,6 +7901,7 @@
     </w:p>
     <w:p>
       <w:pPr>
+        <w:keepNext/>
         <w:spacing w:after="120"/>
       </w:pPr>
       <w:r>
@@ -8765,6 +8777,7 @@
     </w:p>
     <w:p>
       <w:pPr>
+        <w:keepNext/>
         <w:spacing w:after="120"/>
       </w:pPr>
       <w:r>
@@ -9160,6 +9173,7 @@
     </w:p>
     <w:p>
       <w:pPr>
+        <w:keepNext/>
         <w:spacing w:after="120"/>
       </w:pPr>
       <w:r>
@@ -10476,6 +10490,7 @@
     </w:p>
     <w:p>
       <w:pPr>
+        <w:keepNext/>
         <w:spacing w:after="120"/>
       </w:pPr>
       <w:r>
@@ -11120,6 +11135,7 @@
     </w:p>
     <w:p>
       <w:pPr>
+        <w:keepNext/>
         <w:spacing w:after="120"/>
         <w:jc w:val="both"/>
       </w:pPr>
@@ -11220,6 +11236,7 @@
           </w:tcPr>
           <w:p>
             <w:pPr>
+              <w:keepNext/>
               <w:jc w:val="left"/>
             </w:pPr>
             <w:r>
@@ -11244,6 +11261,7 @@
           </w:tcPr>
           <w:p>
             <w:pPr>
+              <w:keepNext/>
               <w:jc w:val="left"/>
             </w:pPr>
             <w:r>
@@ -11268,6 +11286,7 @@
           </w:tcPr>
           <w:p>
             <w:pPr>
+              <w:keepNext/>
               <w:jc w:val="left"/>
             </w:pPr>
             <w:r>
@@ -11297,6 +11316,7 @@
           </w:tcPr>
           <w:p>
             <w:pPr>
+              <w:keepNext/>
               <w:jc w:val="left"/>
             </w:pPr>
             <w:r>
@@ -11321,6 +11341,7 @@
           </w:tcPr>
           <w:p>
             <w:pPr>
+              <w:keepNext/>
               <w:jc w:val="left"/>
             </w:pPr>
             <w:r>
@@ -11345,6 +11366,7 @@
           </w:tcPr>
           <w:p>
             <w:pPr>
+              <w:keepNext/>
               <w:jc w:val="left"/>
             </w:pPr>
             <w:r>
@@ -11461,6 +11483,7 @@
     <w:p>
       <w:pPr>
         <w:pStyle w:val="Ttulo2"/>
+        <w:keepNext/>
       </w:pPr>
       <w:bookmarkStart w:id="21" w:name="_Toc241501392"/>
       <w:r>
@@ -11630,6 +11653,7 @@
           </w:tcPr>
           <w:p>
             <w:pPr>
+              <w:keepNext/>
               <w:jc w:val="left"/>
             </w:pPr>
             <w:r>
@@ -11654,6 +11678,7 @@
           </w:tcPr>
           <w:p>
             <w:pPr>
+              <w:keepNext/>
               <w:jc w:val="left"/>
             </w:pPr>
             <w:r>
@@ -11678,6 +11703,7 @@
           </w:tcPr>
           <w:p>
             <w:pPr>
+              <w:keepNext/>
               <w:jc w:val="left"/>
             </w:pPr>
             <w:r>
@@ -11702,6 +11728,7 @@
           </w:tcPr>
           <w:p>
             <w:pPr>
+              <w:keepNext/>
               <w:jc w:val="left"/>
             </w:pPr>
             <w:r>
@@ -11726,6 +11753,7 @@
           </w:tcPr>
           <w:p>
             <w:pPr>
+              <w:keepNext/>
               <w:jc w:val="left"/>
             </w:pPr>
             <w:r>
@@ -11750,6 +11778,7 @@
           </w:tcPr>
           <w:p>
             <w:pPr>
+              <w:keepNext/>
               <w:jc w:val="left"/>
             </w:pPr>
             <w:r>
@@ -11779,6 +11808,7 @@
           </w:tcPr>
           <w:p>
             <w:pPr>
+              <w:keepNext/>
               <w:jc w:val="left"/>
             </w:pPr>
             <w:r>
@@ -11803,6 +11833,7 @@
           </w:tcPr>
           <w:p>
             <w:pPr>
+              <w:keepNext/>
               <w:jc w:val="left"/>
             </w:pPr>
             <w:r>
@@ -11827,6 +11858,7 @@
           </w:tcPr>
           <w:p>
             <w:pPr>
+              <w:keepNext/>
               <w:jc w:val="left"/>
             </w:pPr>
             <w:r>
@@ -11851,6 +11883,7 @@
           </w:tcPr>
           <w:p>
             <w:pPr>
+              <w:keepNext/>
               <w:jc w:val="left"/>
             </w:pPr>
             <w:r>
@@ -11868,6 +11901,7 @@
           </w:tcPr>
           <w:p>
             <w:pPr>
+              <w:keepNext/>
               <w:jc w:val="left"/>
             </w:pPr>
             <w:r>
@@ -11892,6 +11926,7 @@
           </w:tcPr>
           <w:p>
             <w:pPr>
+              <w:keepNext/>
               <w:jc w:val="left"/>
             </w:pPr>
             <w:r>
@@ -11921,6 +11956,7 @@
           </w:tcPr>
           <w:p>
             <w:pPr>
+              <w:keepNext/>
               <w:jc w:val="left"/>
             </w:pPr>
             <w:r>
@@ -11945,6 +11981,7 @@
           </w:tcPr>
           <w:p>
             <w:pPr>
+              <w:keepNext/>
               <w:jc w:val="left"/>
             </w:pPr>
             <w:r>
@@ -11969,6 +12006,7 @@
           </w:tcPr>
           <w:p>
             <w:pPr>
+              <w:keepNext/>
               <w:jc w:val="left"/>
             </w:pPr>
             <w:r>
@@ -11993,6 +12031,7 @@
           </w:tcPr>
           <w:p>
             <w:pPr>
+              <w:keepNext/>
               <w:jc w:val="left"/>
             </w:pPr>
             <w:r>
@@ -12010,6 +12049,7 @@
           </w:tcPr>
           <w:p>
             <w:pPr>
+              <w:keepNext/>
               <w:jc w:val="left"/>
             </w:pPr>
             <w:r>
@@ -12034,6 +12074,7 @@
           </w:tcPr>
           <w:p>
             <w:pPr>
+              <w:keepNext/>
               <w:jc w:val="left"/>
             </w:pPr>
             <w:r>
@@ -12210,6 +12251,7 @@
     </w:p>
     <w:p>
       <w:pPr>
+        <w:keepNext/>
         <w:jc w:val="center"/>
       </w:pPr>
       <w:r>
@@ -12272,6 +12314,7 @@
     </w:p>
     <w:p>
       <w:pPr>
+        <w:keepNext/>
         <w:spacing w:after="120"/>
         <w:jc w:val="both"/>
       </w:pPr>
@@ -12393,6 +12436,7 @@
           </w:tcPr>
           <w:p>
             <w:pPr>
+              <w:keepNext/>
               <w:jc w:val="left"/>
             </w:pPr>
             <w:r>
@@ -12417,6 +12461,7 @@
           </w:tcPr>
           <w:p>
             <w:pPr>
+              <w:keepNext/>
               <w:jc w:val="left"/>
             </w:pPr>
             <w:r>
@@ -12441,6 +12486,7 @@
           </w:tcPr>
           <w:p>
             <w:pPr>
+              <w:keepNext/>
               <w:jc w:val="left"/>
             </w:pPr>
             <w:r>
@@ -12465,6 +12511,7 @@
           </w:tcPr>
           <w:p>
             <w:pPr>
+              <w:keepNext/>
               <w:jc w:val="left"/>
             </w:pPr>
             <w:r>
@@ -12494,6 +12541,7 @@
           </w:tcPr>
           <w:p>
             <w:pPr>
+              <w:keepNext/>
               <w:jc w:val="left"/>
             </w:pPr>
             <w:r>
@@ -12518,6 +12566,7 @@
           </w:tcPr>
           <w:p>
             <w:pPr>
+              <w:keepNext/>
               <w:jc w:val="left"/>
             </w:pPr>
             <w:r>
@@ -12542,6 +12591,7 @@
           </w:tcPr>
           <w:p>
             <w:pPr>
+              <w:keepNext/>
               <w:jc w:val="left"/>
             </w:pPr>
             <w:r>
@@ -12566,6 +12616,7 @@
           </w:tcPr>
           <w:p>
             <w:pPr>
+              <w:keepNext/>
               <w:jc w:val="left"/>
             </w:pPr>
             <w:r>
@@ -12595,6 +12646,7 @@
           </w:tcPr>
           <w:p>
             <w:pPr>
+              <w:keepNext/>
               <w:jc w:val="left"/>
             </w:pPr>
             <w:r>
@@ -12619,6 +12671,7 @@
           </w:tcPr>
           <w:p>
             <w:pPr>
+              <w:keepNext/>
               <w:jc w:val="left"/>
             </w:pPr>
             <w:r>
@@ -12643,6 +12696,7 @@
           </w:tcPr>
           <w:p>
             <w:pPr>
+              <w:keepNext/>
               <w:jc w:val="left"/>
             </w:pPr>
             <w:r>
@@ -12667,6 +12721,7 @@
           </w:tcPr>
           <w:p>
             <w:pPr>
+              <w:keepNext/>
               <w:jc w:val="left"/>
             </w:pPr>
             <w:r>
@@ -12863,6 +12918,7 @@
     </w:p>
     <w:p>
       <w:pPr>
+        <w:keepNext/>
         <w:spacing w:after="120"/>
         <w:jc w:val="both"/>
       </w:pPr>
@@ -13769,6 +13825,7 @@
     </w:p>
     <w:p>
       <w:pPr>
+        <w:keepNext/>
         <w:jc w:val="both"/>
       </w:pPr>
       <w:r>
@@ -13910,6 +13967,7 @@
           </w:tcPr>
           <w:p>
             <w:pPr>
+              <w:keepNext/>
               <w:jc w:val="left"/>
             </w:pPr>
             <w:r>
@@ -13934,6 +13992,7 @@
           </w:tcPr>
           <w:p>
             <w:pPr>
+              <w:keepNext/>
               <w:jc w:val="left"/>
             </w:pPr>
             <w:r>
@@ -13958,6 +14017,7 @@
           </w:tcPr>
           <w:p>
             <w:pPr>
+              <w:keepNext/>
               <w:jc w:val="left"/>
             </w:pPr>
             <w:r>
@@ -13982,6 +14042,7 @@
           </w:tcPr>
           <w:p>
             <w:pPr>
+              <w:keepNext/>
               <w:jc w:val="left"/>
             </w:pPr>
             <w:r>
@@ -13999,6 +14060,7 @@
           </w:tcPr>
           <w:p>
             <w:pPr>
+              <w:keepNext/>
               <w:jc w:val="left"/>
             </w:pPr>
             <w:r>
@@ -14157,6 +14219,7 @@
     </w:p>
     <w:p>
       <w:pPr>
+        <w:keepNext/>
         <w:jc w:val="center"/>
       </w:pPr>
       <w:r>
@@ -14219,6 +14282,7 @@
     </w:p>
     <w:p>
       <w:pPr>
+        <w:keepNext/>
         <w:spacing w:after="120"/>
         <w:jc w:val="both"/>
       </w:pPr>
@@ -14361,6 +14425,7 @@
           </w:tcPr>
           <w:p>
             <w:pPr>
+              <w:keepNext/>
               <w:jc w:val="left"/>
             </w:pPr>
             <w:r>
@@ -14385,6 +14450,7 @@
           </w:tcPr>
           <w:p>
             <w:pPr>
+              <w:keepNext/>
               <w:jc w:val="left"/>
             </w:pPr>
             <w:r>
@@ -14409,6 +14475,7 @@
           </w:tcPr>
           <w:p>
             <w:pPr>
+              <w:keepNext/>
               <w:jc w:val="left"/>
             </w:pPr>
             <w:r>
@@ -14433,6 +14500,7 @@
           </w:tcPr>
           <w:p>
             <w:pPr>
+              <w:keepNext/>
               <w:jc w:val="left"/>
             </w:pPr>
             <w:r>
@@ -14457,6 +14525,7 @@
           </w:tcPr>
           <w:p>
             <w:pPr>
+              <w:keepNext/>
               <w:jc w:val="left"/>
             </w:pPr>
             <w:r>
@@ -14622,6 +14691,7 @@
     </w:p>
     <w:p>
       <w:pPr>
+        <w:keepNext/>
         <w:jc w:val="center"/>
       </w:pPr>
       <w:r>
@@ -17114,6 +17184,7 @@
     <w:p>
       <w:pPr>
         <w:pStyle w:val="Ttulo2"/>
+        <w:keepNext/>
       </w:pPr>
       <w:bookmarkStart w:id="31" w:name="_Toc241501402"/>
       <w:r>
@@ -17253,6 +17324,7 @@
           </w:tcPr>
           <w:p>
             <w:pPr>
+              <w:keepNext/>
               <w:jc w:val="left"/>
             </w:pPr>
             <w:r>
@@ -17277,6 +17349,7 @@
           </w:tcPr>
           <w:p>
             <w:pPr>
+              <w:keepNext/>
               <w:jc w:val="left"/>
             </w:pPr>
             <w:r>
@@ -17301,6 +17374,7 @@
           </w:tcPr>
           <w:p>
             <w:pPr>
+              <w:keepNext/>
               <w:jc w:val="left"/>
             </w:pPr>
             <w:r>
@@ -17325,6 +17399,7 @@
           </w:tcPr>
           <w:p>
             <w:pPr>
+              <w:keepNext/>
               <w:jc w:val="left"/>
             </w:pPr>
             <w:r>
@@ -17342,6 +17417,7 @@
           </w:tcPr>
           <w:p>
             <w:pPr>
+              <w:keepNext/>
               <w:jc w:val="left"/>
             </w:pPr>
             <w:r>
@@ -17364,6 +17440,7 @@
           </w:tcPr>
           <w:p>
             <w:pPr>
+              <w:keepNext/>
               <w:jc w:val="left"/>
             </w:pPr>
             <w:r>
@@ -17388,6 +17465,7 @@
           </w:tcPr>
           <w:p>
             <w:pPr>
+              <w:keepNext/>
               <w:jc w:val="left"/>
             </w:pPr>
             <w:r>
@@ -17412,6 +17490,7 @@
           </w:tcPr>
           <w:p>
             <w:pPr>
+              <w:keepNext/>
               <w:jc w:val="left"/>
             </w:pPr>
             <w:r>
@@ -17436,6 +17515,7 @@
           </w:tcPr>
           <w:p>
             <w:pPr>
+              <w:keepNext/>
               <w:jc w:val="left"/>
             </w:pPr>
             <w:r>
@@ -17460,6 +17540,7 @@
           </w:tcPr>
           <w:p>
             <w:pPr>
+              <w:keepNext/>
               <w:jc w:val="left"/>
             </w:pPr>
             <w:r>
@@ -17489,6 +17570,7 @@
           </w:tcPr>
           <w:p>
             <w:pPr>
+              <w:keepNext/>
               <w:jc w:val="left"/>
             </w:pPr>
             <w:r>
@@ -17513,6 +17595,7 @@
           </w:tcPr>
           <w:p>
             <w:pPr>
+              <w:keepNext/>
               <w:jc w:val="left"/>
             </w:pPr>
             <w:r>
@@ -17537,6 +17620,7 @@
           </w:tcPr>
           <w:p>
             <w:pPr>
+              <w:keepNext/>
               <w:jc w:val="left"/>
             </w:pPr>
             <w:r>
@@ -17561,6 +17645,7 @@
           </w:tcPr>
           <w:p>
             <w:pPr>
+              <w:keepNext/>
               <w:jc w:val="left"/>
             </w:pPr>
             <w:r>
@@ -17585,6 +17670,7 @@
           </w:tcPr>
           <w:p>
             <w:pPr>
+              <w:keepNext/>
               <w:jc w:val="left"/>
             </w:pPr>
             <w:r>
@@ -17614,6 +17700,7 @@
           </w:tcPr>
           <w:p>
             <w:pPr>
+              <w:keepNext/>
               <w:jc w:val="left"/>
             </w:pPr>
             <w:r>
@@ -17638,6 +17725,7 @@
           </w:tcPr>
           <w:p>
             <w:pPr>
+              <w:keepNext/>
               <w:jc w:val="left"/>
             </w:pPr>
             <w:r>
@@ -17662,6 +17750,7 @@
           </w:tcPr>
           <w:p>
             <w:pPr>
+              <w:keepNext/>
               <w:jc w:val="left"/>
             </w:pPr>
             <w:r>
@@ -17686,6 +17775,7 @@
           </w:tcPr>
           <w:p>
             <w:pPr>
+              <w:keepNext/>
               <w:jc w:val="left"/>
             </w:pPr>
             <w:r>
@@ -17710,6 +17800,7 @@
           </w:tcPr>
           <w:p>
             <w:pPr>
+              <w:keepNext/>
               <w:jc w:val="left"/>
             </w:pPr>
             <w:r>
@@ -17739,6 +17830,7 @@
           </w:tcPr>
           <w:p>
             <w:pPr>
+              <w:keepNext/>
               <w:jc w:val="left"/>
             </w:pPr>
             <w:r>
@@ -17763,6 +17855,7 @@
           </w:tcPr>
           <w:p>
             <w:pPr>
+              <w:keepNext/>
               <w:jc w:val="left"/>
             </w:pPr>
             <w:r>
@@ -17787,6 +17880,7 @@
           </w:tcPr>
           <w:p>
             <w:pPr>
+              <w:keepNext/>
               <w:jc w:val="left"/>
             </w:pPr>
             <w:r>
@@ -17811,6 +17905,7 @@
           </w:tcPr>
           <w:p>
             <w:pPr>
+              <w:keepNext/>
               <w:jc w:val="left"/>
             </w:pPr>
             <w:r>
@@ -17835,6 +17930,7 @@
           </w:tcPr>
           <w:p>
             <w:pPr>
+              <w:keepNext/>
               <w:jc w:val="left"/>
             </w:pPr>
             <w:r>
@@ -18002,6 +18098,7 @@
     </w:p>
     <w:p>
       <w:pPr>
+        <w:keepNext/>
         <w:spacing w:after="120"/>
         <w:jc w:val="both"/>
       </w:pPr>
@@ -18119,6 +18216,7 @@
           </w:tcPr>
           <w:p>
             <w:pPr>
+              <w:keepNext/>
               <w:jc w:val="left"/>
             </w:pPr>
             <w:r>
@@ -18143,6 +18241,7 @@
           </w:tcPr>
           <w:p>
             <w:pPr>
+              <w:keepNext/>
               <w:jc w:val="left"/>
             </w:pPr>
             <w:r>
@@ -18167,6 +18266,7 @@
           </w:tcPr>
           <w:p>
             <w:pPr>
+              <w:keepNext/>
               <w:jc w:val="left"/>
             </w:pPr>
             <w:r>
@@ -18191,6 +18291,7 @@
           </w:tcPr>
           <w:p>
             <w:pPr>
+              <w:keepNext/>
               <w:jc w:val="left"/>
             </w:pPr>
             <w:r>
@@ -18220,6 +18321,7 @@
           </w:tcPr>
           <w:p>
             <w:pPr>
+              <w:keepNext/>
               <w:jc w:val="left"/>
             </w:pPr>
             <w:r>
@@ -18244,6 +18346,7 @@
           </w:tcPr>
           <w:p>
             <w:pPr>
+              <w:keepNext/>
               <w:jc w:val="left"/>
             </w:pPr>
             <w:r>
@@ -18268,6 +18371,7 @@
           </w:tcPr>
           <w:p>
             <w:pPr>
+              <w:keepNext/>
               <w:jc w:val="left"/>
             </w:pPr>
             <w:r>
@@ -18292,6 +18396,7 @@
           </w:tcPr>
           <w:p>
             <w:pPr>
+              <w:keepNext/>
               <w:jc w:val="left"/>
             </w:pPr>
             <w:r>
@@ -18321,6 +18426,7 @@
           </w:tcPr>
           <w:p>
             <w:pPr>
+              <w:keepNext/>
               <w:jc w:val="left"/>
             </w:pPr>
             <w:r>
@@ -18345,6 +18451,7 @@
           </w:tcPr>
           <w:p>
             <w:pPr>
+              <w:keepNext/>
               <w:jc w:val="left"/>
             </w:pPr>
             <w:r>
@@ -18369,6 +18476,7 @@
           </w:tcPr>
           <w:p>
             <w:pPr>
+              <w:keepNext/>
               <w:jc w:val="left"/>
             </w:pPr>
             <w:r>
@@ -18393,6 +18501,7 @@
           </w:tcPr>
           <w:p>
             <w:pPr>
+              <w:keepNext/>
               <w:jc w:val="left"/>
             </w:pPr>
             <w:r>
@@ -18422,6 +18531,7 @@
           </w:tcPr>
           <w:p>
             <w:pPr>
+              <w:keepNext/>
               <w:jc w:val="left"/>
             </w:pPr>
             <w:r>
@@ -18446,6 +18556,7 @@
           </w:tcPr>
           <w:p>
             <w:pPr>
+              <w:keepNext/>
               <w:jc w:val="left"/>
             </w:pPr>
             <w:r>
@@ -18470,6 +18581,7 @@
           </w:tcPr>
           <w:p>
             <w:pPr>
+              <w:keepNext/>
               <w:jc w:val="left"/>
             </w:pPr>
             <w:r>
@@ -18494,6 +18606,7 @@
           </w:tcPr>
           <w:p>
             <w:pPr>
+              <w:keepNext/>
               <w:jc w:val="left"/>
             </w:pPr>
             <w:r>
@@ -18523,6 +18636,7 @@
           </w:tcPr>
           <w:p>
             <w:pPr>
+              <w:keepNext/>
               <w:jc w:val="left"/>
             </w:pPr>
             <w:r>
@@ -18547,6 +18661,7 @@
           </w:tcPr>
           <w:p>
             <w:pPr>
+              <w:keepNext/>
               <w:jc w:val="left"/>
             </w:pPr>
             <w:r>
@@ -18571,6 +18686,7 @@
           </w:tcPr>
           <w:p>
             <w:pPr>
+              <w:keepNext/>
               <w:jc w:val="left"/>
             </w:pPr>
             <w:r>
@@ -18595,6 +18711,7 @@
           </w:tcPr>
           <w:p>
             <w:pPr>
+              <w:keepNext/>
               <w:jc w:val="left"/>
             </w:pPr>
             <w:r>

</xml_diff>

<commit_message>
docs: formato y cortes de pagina del manual y del informe
</commit_message>
<xml_diff>
--- a/Entrega_Fase2_Grupo14/1_Informe/Informe_Fase2_Grupo14_RutaMoto.docx
+++ b/Entrega_Fase2_Grupo14/1_Informe/Informe_Fase2_Grupo14_RutaMoto.docx
@@ -1478,7 +1478,7 @@
             <w:noProof/>
             <w:webHidden/>
           </w:rPr>
-          <w:t>7</w:t>
+          <w:t>6</w:t>
         </w:r>
         <w:r>
           <w:rPr>
@@ -1572,7 +1572,7 @@
             <w:noProof/>
             <w:webHidden/>
           </w:rPr>
-          <w:t>7</w:t>
+          <w:t>8</w:t>
         </w:r>
         <w:r>
           <w:rPr>
@@ -1760,7 +1760,7 @@
             <w:noProof/>
             <w:webHidden/>
           </w:rPr>
-          <w:t>10</w:t>
+          <w:t>11</w:t>
         </w:r>
         <w:r>
           <w:rPr>
@@ -1854,7 +1854,7 @@
             <w:noProof/>
             <w:webHidden/>
           </w:rPr>
-          <w:t>10</w:t>
+          <w:t>11</w:t>
         </w:r>
         <w:r>
           <w:rPr>
@@ -1948,7 +1948,7 @@
             <w:noProof/>
             <w:webHidden/>
           </w:rPr>
-          <w:t>12</w:t>
+          <w:t>13</w:t>
         </w:r>
         <w:r>
           <w:rPr>
@@ -2042,7 +2042,7 @@
             <w:noProof/>
             <w:webHidden/>
           </w:rPr>
-          <w:t>15</w:t>
+          <w:t>16</w:t>
         </w:r>
         <w:r>
           <w:rPr>
@@ -2136,7 +2136,7 @@
             <w:noProof/>
             <w:webHidden/>
           </w:rPr>
-          <w:t>16</w:t>
+          <w:t>17</w:t>
         </w:r>
         <w:r>
           <w:rPr>
@@ -2230,7 +2230,7 @@
             <w:noProof/>
             <w:webHidden/>
           </w:rPr>
-          <w:t>18</w:t>
+          <w:t>20</w:t>
         </w:r>
         <w:r>
           <w:rPr>
@@ -2324,7 +2324,7 @@
             <w:noProof/>
             <w:webHidden/>
           </w:rPr>
-          <w:t>19</w:t>
+          <w:t>20</w:t>
         </w:r>
         <w:r>
           <w:rPr>
@@ -2418,7 +2418,7 @@
             <w:noProof/>
             <w:webHidden/>
           </w:rPr>
-          <w:t>19</w:t>
+          <w:t>20</w:t>
         </w:r>
         <w:r>
           <w:rPr>
@@ -2512,7 +2512,7 @@
             <w:noProof/>
             <w:webHidden/>
           </w:rPr>
-          <w:t>22</w:t>
+          <w:t>23</w:t>
         </w:r>
         <w:r>
           <w:rPr>
@@ -2606,7 +2606,7 @@
             <w:noProof/>
             <w:webHidden/>
           </w:rPr>
-          <w:t>24</w:t>
+          <w:t>25</w:t>
         </w:r>
         <w:r>
           <w:rPr>
@@ -2700,7 +2700,7 @@
             <w:noProof/>
             <w:webHidden/>
           </w:rPr>
-          <w:t>24</w:t>
+          <w:t>25</w:t>
         </w:r>
         <w:r>
           <w:rPr>
@@ -2794,7 +2794,7 @@
             <w:noProof/>
             <w:webHidden/>
           </w:rPr>
-          <w:t>25</w:t>
+          <w:t>26</w:t>
         </w:r>
         <w:r>
           <w:rPr>
@@ -2888,7 +2888,7 @@
             <w:noProof/>
             <w:webHidden/>
           </w:rPr>
-          <w:t>26</w:t>
+          <w:t>27</w:t>
         </w:r>
         <w:r>
           <w:rPr>
@@ -2982,7 +2982,7 @@
             <w:noProof/>
             <w:webHidden/>
           </w:rPr>
-          <w:t>27</w:t>
+          <w:t>28</w:t>
         </w:r>
         <w:r>
           <w:rPr>
@@ -3076,7 +3076,7 @@
             <w:noProof/>
             <w:webHidden/>
           </w:rPr>
-          <w:t>27</w:t>
+          <w:t>28</w:t>
         </w:r>
         <w:r>
           <w:rPr>
@@ -3170,7 +3170,7 @@
             <w:noProof/>
             <w:webHidden/>
           </w:rPr>
-          <w:t>28</w:t>
+          <w:t>29</w:t>
         </w:r>
         <w:r>
           <w:rPr>
@@ -3264,7 +3264,7 @@
             <w:noProof/>
             <w:webHidden/>
           </w:rPr>
-          <w:t>29</w:t>
+          <w:t>30</w:t>
         </w:r>
         <w:r>
           <w:rPr>
@@ -3358,7 +3358,7 @@
             <w:noProof/>
             <w:webHidden/>
           </w:rPr>
-          <w:t>30</w:t>
+          <w:t>32</w:t>
         </w:r>
         <w:r>
           <w:rPr>
@@ -3452,7 +3452,7 @@
             <w:noProof/>
             <w:webHidden/>
           </w:rPr>
-          <w:t>32</w:t>
+          <w:t>34</w:t>
         </w:r>
         <w:r>
           <w:rPr>
@@ -3546,7 +3546,7 @@
             <w:noProof/>
             <w:webHidden/>
           </w:rPr>
-          <w:t>33</w:t>
+          <w:t>36</w:t>
         </w:r>
         <w:r>
           <w:rPr>
@@ -3640,7 +3640,7 @@
             <w:noProof/>
             <w:webHidden/>
           </w:rPr>
-          <w:t>35</w:t>
+          <w:t>38</w:t>
         </w:r>
         <w:r>
           <w:rPr>
@@ -3734,7 +3734,7 @@
             <w:noProof/>
             <w:webHidden/>
           </w:rPr>
-          <w:t>36</w:t>
+          <w:t>38</w:t>
         </w:r>
         <w:r>
           <w:rPr>
@@ -3828,7 +3828,7 @@
             <w:noProof/>
             <w:webHidden/>
           </w:rPr>
-          <w:t>38</w:t>
+          <w:t>40</w:t>
         </w:r>
         <w:r>
           <w:rPr>
@@ -3922,7 +3922,7 @@
             <w:noProof/>
             <w:webHidden/>
           </w:rPr>
-          <w:t>39</w:t>
+          <w:t>42</w:t>
         </w:r>
         <w:r>
           <w:rPr>
@@ -4016,7 +4016,7 @@
             <w:noProof/>
             <w:webHidden/>
           </w:rPr>
-          <w:t>41</w:t>
+          <w:t>44</w:t>
         </w:r>
         <w:r>
           <w:rPr>
@@ -4110,7 +4110,7 @@
             <w:noProof/>
             <w:webHidden/>
           </w:rPr>
-          <w:t>42</w:t>
+          <w:t>46</w:t>
         </w:r>
         <w:r>
           <w:rPr>
@@ -4403,6 +4403,7 @@
     <w:p>
       <w:pPr>
         <w:pStyle w:val="Ttulo1"/>
+        <w:pageBreakBefore/>
       </w:pPr>
       <w:bookmarkStart w:id="5" w:name="_Toc241501376"/>
       <w:r>
@@ -4442,9 +4443,7 @@
       <w:bookmarkEnd w:id="6"/>
     </w:p>
     <w:p>
-      <w:pPr>
-        <w:keepNext/>
-      </w:pPr>
+      <w:pPr/>
       <w:r>
         <w:t xml:space="preserve">La tabla siguiente retoma las actividades que el cronograma de la Fase 1 asignó a esta segunda fase y las contrasta con lo que efectivamente ocurrió. Al repartir el trabajo de la fase, la carga de datos, que el cronograma original asignaba a todo el equipo, se dividió entre la importación masiva y la carga manual. Además, las cotizaciones, el informe de inventario y el tablero de oportunidades se agregaron como actividades propias. Estos cambios responden al detalle de la rúbrica de esta </w:t>
       </w:r>
@@ -4457,6 +4456,7 @@
       <w:tblPr>
         <w:tblStyle w:val="Tablaconcuadrcula"/>
         <w:tblW w:w="0" w:type="auto"/>
+        <w:jc w:val="center"/>
         <w:tblLayout w:type="fixed"/>
         <w:tblLook w:val="04A0" w:firstRow="1" w:lastRow="0" w:firstColumn="1" w:lastColumn="0" w:noHBand="0" w:noVBand="1"/>
       </w:tblPr>
@@ -4583,7 +4583,6 @@
           </w:tcPr>
           <w:p>
             <w:pPr>
-              <w:keepNext/>
               <w:spacing w:after="0"/>
               <w:jc w:val="left"/>
             </w:pPr>
@@ -4601,7 +4600,6 @@
           </w:tcPr>
           <w:p>
             <w:pPr>
-              <w:keepNext/>
               <w:spacing w:after="0"/>
               <w:jc w:val="left"/>
             </w:pPr>
@@ -4627,7 +4625,6 @@
           </w:tcPr>
           <w:p>
             <w:pPr>
-              <w:keepNext/>
               <w:spacing w:after="0"/>
               <w:jc w:val="left"/>
             </w:pPr>
@@ -4645,7 +4642,6 @@
           </w:tcPr>
           <w:p>
             <w:pPr>
-              <w:keepNext/>
               <w:spacing w:after="0"/>
               <w:jc w:val="left"/>
             </w:pPr>
@@ -4663,7 +4659,6 @@
           </w:tcPr>
           <w:p>
             <w:pPr>
-              <w:keepNext/>
               <w:spacing w:after="0"/>
               <w:jc w:val="left"/>
             </w:pPr>
@@ -4686,7 +4681,6 @@
           </w:tcPr>
           <w:p>
             <w:pPr>
-              <w:keepNext/>
               <w:spacing w:after="0"/>
               <w:jc w:val="left"/>
             </w:pPr>
@@ -4704,7 +4698,6 @@
           </w:tcPr>
           <w:p>
             <w:pPr>
-              <w:keepNext/>
               <w:spacing w:after="0"/>
               <w:jc w:val="left"/>
             </w:pPr>
@@ -4730,7 +4723,6 @@
           </w:tcPr>
           <w:p>
             <w:pPr>
-              <w:keepNext/>
               <w:spacing w:after="0"/>
               <w:jc w:val="left"/>
             </w:pPr>
@@ -4748,7 +4740,6 @@
           </w:tcPr>
           <w:p>
             <w:pPr>
-              <w:keepNext/>
               <w:spacing w:after="0"/>
               <w:jc w:val="left"/>
             </w:pPr>
@@ -4766,7 +4757,6 @@
           </w:tcPr>
           <w:p>
             <w:pPr>
-              <w:keepNext/>
               <w:spacing w:after="0"/>
               <w:jc w:val="left"/>
             </w:pPr>
@@ -4789,7 +4779,6 @@
           </w:tcPr>
           <w:p>
             <w:pPr>
-              <w:keepNext/>
               <w:spacing w:after="0"/>
               <w:jc w:val="left"/>
             </w:pPr>
@@ -4807,7 +4796,6 @@
           </w:tcPr>
           <w:p>
             <w:pPr>
-              <w:keepNext/>
               <w:spacing w:after="0"/>
               <w:jc w:val="left"/>
             </w:pPr>
@@ -4839,7 +4827,6 @@
           </w:tcPr>
           <w:p>
             <w:pPr>
-              <w:keepNext/>
               <w:spacing w:after="0"/>
               <w:jc w:val="left"/>
             </w:pPr>
@@ -4857,7 +4844,6 @@
           </w:tcPr>
           <w:p>
             <w:pPr>
-              <w:keepNext/>
               <w:spacing w:after="0"/>
               <w:jc w:val="left"/>
             </w:pPr>
@@ -4875,7 +4861,6 @@
           </w:tcPr>
           <w:p>
             <w:pPr>
-              <w:keepNext/>
               <w:spacing w:after="0"/>
               <w:jc w:val="left"/>
             </w:pPr>
@@ -5123,9 +5108,7 @@
       <w:bookmarkEnd w:id="7"/>
     </w:p>
     <w:p>
-      <w:pPr>
-        <w:keepNext/>
-      </w:pPr>
+      <w:pPr/>
       <w:r>
         <w:t>Al revisar los entregables de la primera fase, el equipo encontró que el procedimiento de activación del CRM no documentaba con captura de pantalla todos sus pasos críticos. Como la rúbrica de esta fase vuelve a evaluar los manuales de instalación y configuración, esas capturas se completaron y el manual de instalación se entrega de nuevo, actualizado, como MU-00.</w:t>
       </w:r>
@@ -5134,6 +5117,7 @@
       <w:tblPr>
         <w:tblStyle w:val="Tablaconcuadrcula"/>
         <w:tblW w:w="0" w:type="auto"/>
+        <w:jc w:val="center"/>
         <w:tblLayout w:type="fixed"/>
         <w:tblLook w:val="04A0" w:firstRow="1" w:lastRow="0" w:firstColumn="1" w:lastColumn="0" w:noHBand="0" w:noVBand="1"/>
       </w:tblPr>
@@ -5285,6 +5269,7 @@
     <w:p>
       <w:pPr>
         <w:pStyle w:val="Ttulo1"/>
+        <w:pageBreakBefore/>
       </w:pPr>
       <w:bookmarkStart w:id="8" w:name="_Toc241501379"/>
       <w:r>
@@ -5384,6 +5369,7 @@
       <w:tblPr>
         <w:tblStyle w:val="Tablaconcuadrcula"/>
         <w:tblW w:w="0" w:type="auto"/>
+        <w:jc w:val="center"/>
         <w:tblLayout w:type="fixed"/>
         <w:tblLook w:val="04A0" w:firstRow="1" w:lastRow="0" w:firstColumn="1" w:lastColumn="0" w:noHBand="0" w:noVBand="1"/>
       </w:tblPr>
@@ -5468,7 +5454,6 @@
           </w:tcPr>
           <w:p>
             <w:pPr>
-              <w:keepNext/>
               <w:spacing w:after="0"/>
               <w:jc w:val="left"/>
             </w:pPr>
@@ -5486,7 +5471,6 @@
           </w:tcPr>
           <w:p>
             <w:pPr>
-              <w:keepNext/>
               <w:spacing w:after="0"/>
               <w:jc w:val="left"/>
             </w:pPr>
@@ -5506,7 +5490,6 @@
           </w:tcPr>
           <w:p>
             <w:pPr>
-              <w:keepNext/>
               <w:spacing w:after="0"/>
               <w:jc w:val="left"/>
             </w:pPr>
@@ -5529,7 +5512,6 @@
           </w:tcPr>
           <w:p>
             <w:pPr>
-              <w:keepNext/>
               <w:spacing w:after="0"/>
               <w:jc w:val="left"/>
             </w:pPr>
@@ -5547,7 +5529,6 @@
           </w:tcPr>
           <w:p>
             <w:pPr>
-              <w:keepNext/>
               <w:spacing w:after="0"/>
               <w:jc w:val="left"/>
             </w:pPr>
@@ -5567,7 +5548,6 @@
           </w:tcPr>
           <w:p>
             <w:pPr>
-              <w:keepNext/>
               <w:spacing w:after="0"/>
               <w:jc w:val="left"/>
             </w:pPr>
@@ -5723,6 +5703,7 @@
       <w:tblPr>
         <w:tblStyle w:val="Tablaconcuadrcula"/>
         <w:tblW w:w="0" w:type="auto"/>
+        <w:jc w:val="center"/>
         <w:tblLayout w:type="fixed"/>
         <w:tblLook w:val="04A0" w:firstRow="1" w:lastRow="0" w:firstColumn="1" w:lastColumn="0" w:noHBand="0" w:noVBand="1"/>
       </w:tblPr>
@@ -6170,6 +6151,7 @@
       <w:tblPr>
         <w:tblStyle w:val="Tablaconcuadrcula"/>
         <w:tblW w:w="0" w:type="auto"/>
+        <w:jc w:val="center"/>
         <w:tblLayout w:type="fixed"/>
         <w:tblLook w:val="04A0" w:firstRow="1" w:lastRow="0" w:firstColumn="1" w:lastColumn="0" w:noHBand="0" w:noVBand="1"/>
       </w:tblPr>
@@ -6498,6 +6480,7 @@
     <w:p>
       <w:pPr>
         <w:pStyle w:val="Ttulo1"/>
+        <w:pageBreakBefore/>
       </w:pPr>
       <w:bookmarkStart w:id="10" w:name="_Toc241501381"/>
       <w:r>
@@ -6550,6 +6533,7 @@
       <w:tblPr>
         <w:tblStyle w:val="Tablaconcuadrcula"/>
         <w:tblW w:w="0" w:type="auto"/>
+        <w:jc w:val="center"/>
         <w:tblLayout w:type="fixed"/>
         <w:tblLook w:val="04A0" w:firstRow="1" w:lastRow="0" w:firstColumn="1" w:lastColumn="0" w:noHBand="0" w:noVBand="1"/>
       </w:tblPr>
@@ -6664,7 +6648,6 @@
           </w:tcPr>
           <w:p>
             <w:pPr>
-              <w:keepNext/>
               <w:spacing w:after="0"/>
               <w:jc w:val="left"/>
             </w:pPr>
@@ -6682,7 +6665,6 @@
           </w:tcPr>
           <w:p>
             <w:pPr>
-              <w:keepNext/>
               <w:spacing w:after="0"/>
               <w:jc w:val="left"/>
             </w:pPr>
@@ -6700,7 +6682,6 @@
           </w:tcPr>
           <w:p>
             <w:pPr>
-              <w:keepNext/>
               <w:spacing w:after="0"/>
               <w:jc w:val="left"/>
             </w:pPr>
@@ -6718,7 +6699,6 @@
           </w:tcPr>
           <w:p>
             <w:pPr>
-              <w:keepNext/>
               <w:spacing w:after="0"/>
               <w:jc w:val="left"/>
             </w:pPr>
@@ -6741,7 +6721,6 @@
           </w:tcPr>
           <w:p>
             <w:pPr>
-              <w:keepNext/>
               <w:spacing w:after="0"/>
               <w:jc w:val="left"/>
             </w:pPr>
@@ -6759,7 +6738,6 @@
           </w:tcPr>
           <w:p>
             <w:pPr>
-              <w:keepNext/>
               <w:spacing w:after="0"/>
               <w:jc w:val="left"/>
             </w:pPr>
@@ -6777,7 +6755,6 @@
           </w:tcPr>
           <w:p>
             <w:pPr>
-              <w:keepNext/>
               <w:spacing w:after="0"/>
               <w:jc w:val="left"/>
             </w:pPr>
@@ -6795,7 +6772,6 @@
           </w:tcPr>
           <w:p>
             <w:pPr>
-              <w:keepNext/>
               <w:spacing w:after="0"/>
               <w:jc w:val="left"/>
             </w:pPr>
@@ -6818,7 +6794,6 @@
           </w:tcPr>
           <w:p>
             <w:pPr>
-              <w:keepNext/>
               <w:spacing w:after="0"/>
               <w:jc w:val="left"/>
             </w:pPr>
@@ -6836,7 +6811,6 @@
           </w:tcPr>
           <w:p>
             <w:pPr>
-              <w:keepNext/>
               <w:spacing w:after="0"/>
               <w:jc w:val="left"/>
             </w:pPr>
@@ -6860,7 +6834,6 @@
           </w:tcPr>
           <w:p>
             <w:pPr>
-              <w:keepNext/>
               <w:spacing w:after="0"/>
               <w:jc w:val="left"/>
             </w:pPr>
@@ -6878,7 +6851,6 @@
           </w:tcPr>
           <w:p>
             <w:pPr>
-              <w:keepNext/>
               <w:spacing w:after="0"/>
               <w:jc w:val="left"/>
             </w:pPr>
@@ -6901,7 +6873,6 @@
           </w:tcPr>
           <w:p>
             <w:pPr>
-              <w:keepNext/>
               <w:spacing w:after="0"/>
               <w:jc w:val="left"/>
             </w:pPr>
@@ -6919,7 +6890,6 @@
           </w:tcPr>
           <w:p>
             <w:pPr>
-              <w:keepNext/>
               <w:spacing w:after="0"/>
               <w:jc w:val="left"/>
             </w:pPr>
@@ -6937,7 +6907,6 @@
           </w:tcPr>
           <w:p>
             <w:pPr>
-              <w:keepNext/>
               <w:spacing w:after="0"/>
               <w:jc w:val="left"/>
             </w:pPr>
@@ -6955,7 +6924,6 @@
           </w:tcPr>
           <w:p>
             <w:pPr>
-              <w:keepNext/>
               <w:spacing w:after="0"/>
               <w:jc w:val="left"/>
             </w:pPr>
@@ -6978,7 +6946,6 @@
           </w:tcPr>
           <w:p>
             <w:pPr>
-              <w:keepNext/>
               <w:spacing w:after="0"/>
               <w:jc w:val="left"/>
             </w:pPr>
@@ -6996,7 +6963,6 @@
           </w:tcPr>
           <w:p>
             <w:pPr>
-              <w:keepNext/>
               <w:spacing w:after="0"/>
               <w:jc w:val="left"/>
             </w:pPr>
@@ -7014,7 +6980,6 @@
           </w:tcPr>
           <w:p>
             <w:pPr>
-              <w:keepNext/>
               <w:spacing w:after="0"/>
               <w:jc w:val="left"/>
             </w:pPr>
@@ -7032,7 +6997,6 @@
           </w:tcPr>
           <w:p>
             <w:pPr>
-              <w:keepNext/>
               <w:spacing w:after="0"/>
               <w:jc w:val="left"/>
             </w:pPr>
@@ -7346,7 +7310,6 @@
     </w:p>
     <w:p>
       <w:pPr>
-        <w:keepNext/>
         <w:spacing w:after="120"/>
       </w:pPr>
       <w:r>
@@ -7371,7 +7334,7 @@
       <w:r>
         <w:drawing>
           <wp:inline xmlns:a="http://schemas.openxmlformats.org/drawingml/2006/main" xmlns:pic="http://schemas.openxmlformats.org/drawingml/2006/picture">
-            <wp:extent cx="5486400" cy="4286250"/>
+            <wp:extent cx="4032000" cy="3150000"/>
             <wp:docPr id="101" name="Picture 1"/>
             <wp:cNvGraphicFramePr>
               <a:graphicFrameLocks noChangeAspect="1"/>
@@ -7392,7 +7355,7 @@
                   <pic:spPr>
                     <a:xfrm>
                       <a:off x="0" y="0"/>
-                      <a:ext cx="5486400" cy="4286250"/>
+                      <a:ext cx="4032000" cy="3150000"/>
                     </a:xfrm>
                     <a:prstGeom prst="rect"/>
                   </pic:spPr>
@@ -7421,6 +7384,7 @@
       <w:tblPr>
         <w:tblStyle w:val="Tablaconcuadrcula"/>
         <w:tblW w:w="0" w:type="auto"/>
+        <w:jc w:val="center"/>
         <w:tblLayout w:type="fixed"/>
         <w:tblLook w:val="04A0" w:firstRow="1" w:lastRow="0" w:firstColumn="1" w:lastColumn="0" w:noHBand="0" w:noVBand="1"/>
       </w:tblPr>
@@ -7505,7 +7469,6 @@
           </w:tcPr>
           <w:p>
             <w:pPr>
-              <w:keepNext/>
               <w:spacing w:after="0"/>
               <w:jc w:val="left"/>
             </w:pPr>
@@ -7525,7 +7488,6 @@
           </w:tcPr>
           <w:p>
             <w:pPr>
-              <w:keepNext/>
               <w:spacing w:after="0"/>
               <w:jc w:val="left"/>
             </w:pPr>
@@ -7545,7 +7507,6 @@
           </w:tcPr>
           <w:p>
             <w:pPr>
-              <w:keepNext/>
               <w:spacing w:after="0"/>
               <w:jc w:val="left"/>
             </w:pPr>
@@ -7767,7 +7728,7 @@
       <w:r>
         <w:drawing>
           <wp:inline xmlns:a="http://schemas.openxmlformats.org/drawingml/2006/main" xmlns:pic="http://schemas.openxmlformats.org/drawingml/2006/picture">
-            <wp:extent cx="5806440" cy="3085108"/>
+            <wp:extent cx="5486400" cy="2915062"/>
             <wp:docPr id="1460843489" name="Picture 1460843489"/>
             <wp:cNvGraphicFramePr>
               <a:graphicFrameLocks noChangeAspect="1"/>
@@ -7788,7 +7749,7 @@
                   <pic:spPr>
                     <a:xfrm>
                       <a:off x="0" y="0"/>
-                      <a:ext cx="5806440" cy="3085108"/>
+                      <a:ext cx="5486400" cy="2915062"/>
                     </a:xfrm>
                     <a:prstGeom prst="rect"/>
                   </pic:spPr>
@@ -7916,6 +7877,7 @@
       <w:tblPr>
         <w:tblStyle w:val="Tablaconcuadrcula"/>
         <w:tblW w:w="0" w:type="auto"/>
+        <w:jc w:val="center"/>
         <w:tblLayout w:type="fixed"/>
         <w:tblLook w:val="04A0" w:firstRow="1" w:lastRow="0" w:firstColumn="1" w:lastColumn="0" w:noHBand="0" w:noVBand="1"/>
       </w:tblPr>
@@ -8022,7 +7984,6 @@
           </w:tcPr>
           <w:p>
             <w:pPr>
-              <w:keepNext/>
               <w:spacing w:after="0"/>
               <w:jc w:val="left"/>
             </w:pPr>
@@ -8040,7 +8001,6 @@
           </w:tcPr>
           <w:p>
             <w:pPr>
-              <w:keepNext/>
               <w:spacing w:after="0"/>
               <w:jc w:val="left"/>
             </w:pPr>
@@ -8058,7 +8018,6 @@
           </w:tcPr>
           <w:p>
             <w:pPr>
-              <w:keepNext/>
               <w:spacing w:after="0"/>
               <w:jc w:val="left"/>
             </w:pPr>
@@ -8105,7 +8064,6 @@
           </w:tcPr>
           <w:p>
             <w:pPr>
-              <w:keepNext/>
               <w:spacing w:after="0"/>
               <w:jc w:val="left"/>
             </w:pPr>
@@ -8123,7 +8081,6 @@
           </w:tcPr>
           <w:p>
             <w:pPr>
-              <w:keepNext/>
               <w:spacing w:after="0"/>
               <w:jc w:val="left"/>
             </w:pPr>
@@ -8141,7 +8098,6 @@
           </w:tcPr>
           <w:p>
             <w:pPr>
-              <w:keepNext/>
               <w:spacing w:after="0"/>
               <w:jc w:val="left"/>
             </w:pPr>
@@ -8188,7 +8144,6 @@
           </w:tcPr>
           <w:p>
             <w:pPr>
-              <w:keepNext/>
               <w:spacing w:after="0"/>
               <w:jc w:val="left"/>
             </w:pPr>
@@ -8206,7 +8161,6 @@
           </w:tcPr>
           <w:p>
             <w:pPr>
-              <w:keepNext/>
               <w:spacing w:after="0"/>
               <w:jc w:val="left"/>
             </w:pPr>
@@ -8224,7 +8178,6 @@
           </w:tcPr>
           <w:p>
             <w:pPr>
-              <w:keepNext/>
               <w:spacing w:after="0"/>
               <w:jc w:val="left"/>
             </w:pPr>
@@ -8271,7 +8224,6 @@
           </w:tcPr>
           <w:p>
             <w:pPr>
-              <w:keepNext/>
               <w:spacing w:after="0"/>
               <w:jc w:val="left"/>
             </w:pPr>
@@ -8289,7 +8241,6 @@
           </w:tcPr>
           <w:p>
             <w:pPr>
-              <w:keepNext/>
               <w:spacing w:after="0"/>
               <w:jc w:val="left"/>
             </w:pPr>
@@ -8307,7 +8258,6 @@
           </w:tcPr>
           <w:p>
             <w:pPr>
-              <w:keepNext/>
               <w:spacing w:after="0"/>
               <w:jc w:val="left"/>
             </w:pPr>
@@ -8354,7 +8304,6 @@
           </w:tcPr>
           <w:p>
             <w:pPr>
-              <w:keepNext/>
               <w:spacing w:after="0"/>
               <w:jc w:val="left"/>
             </w:pPr>
@@ -8372,7 +8321,6 @@
           </w:tcPr>
           <w:p>
             <w:pPr>
-              <w:keepNext/>
               <w:spacing w:after="0"/>
               <w:jc w:val="left"/>
             </w:pPr>
@@ -8390,7 +8338,6 @@
           </w:tcPr>
           <w:p>
             <w:pPr>
-              <w:keepNext/>
               <w:spacing w:after="0"/>
               <w:jc w:val="left"/>
             </w:pPr>
@@ -8437,7 +8384,6 @@
           </w:tcPr>
           <w:p>
             <w:pPr>
-              <w:keepNext/>
               <w:spacing w:after="0"/>
               <w:jc w:val="left"/>
             </w:pPr>
@@ -8455,7 +8401,6 @@
           </w:tcPr>
           <w:p>
             <w:pPr>
-              <w:keepNext/>
               <w:spacing w:after="0"/>
               <w:jc w:val="left"/>
             </w:pPr>
@@ -8473,7 +8418,6 @@
           </w:tcPr>
           <w:p>
             <w:pPr>
-              <w:keepNext/>
               <w:spacing w:after="0"/>
               <w:jc w:val="left"/>
             </w:pPr>
@@ -8575,6 +8519,7 @@
           </w:tcPr>
           <w:p>
             <w:pPr>
+              <w:keepNext/>
               <w:jc w:val="left"/>
             </w:pPr>
             <w:r>
@@ -8695,6 +8640,7 @@
     <w:p>
       <w:pPr>
         <w:pStyle w:val="Ttulo1"/>
+        <w:pageBreakBefore/>
       </w:pPr>
       <w:bookmarkStart w:id="15" w:name="_Toc241501386"/>
       <w:r>
@@ -8777,7 +8723,6 @@
     </w:p>
     <w:p>
       <w:pPr>
-        <w:keepNext/>
         <w:spacing w:after="120"/>
       </w:pPr>
       <w:r>
@@ -8792,6 +8737,7 @@
       <w:tblPr>
         <w:tblStyle w:val="Tablaconcuadrcula"/>
         <w:tblW w:w="0" w:type="auto"/>
+        <w:jc w:val="center"/>
         <w:tblLayout w:type="fixed"/>
         <w:tblLook w:val="04A0" w:firstRow="1" w:lastRow="0" w:firstColumn="1" w:lastColumn="0" w:noHBand="0" w:noVBand="1"/>
       </w:tblPr>
@@ -9173,7 +9119,6 @@
     </w:p>
     <w:p>
       <w:pPr>
-        <w:keepNext/>
         <w:spacing w:after="120"/>
       </w:pPr>
       <w:r>
@@ -9188,6 +9133,7 @@
       <w:tblPr>
         <w:tblStyle w:val="Tablaconcuadrcula"/>
         <w:tblW w:w="0" w:type="auto"/>
+        <w:jc w:val="center"/>
         <w:tblLayout w:type="fixed"/>
         <w:tblLook w:val="04A0" w:firstRow="1" w:lastRow="0" w:firstColumn="1" w:lastColumn="0" w:noHBand="0" w:noVBand="1"/>
       </w:tblPr>
@@ -9314,7 +9260,6 @@
           </w:tcPr>
           <w:p>
             <w:pPr>
-              <w:keepNext/>
               <w:spacing w:after="0"/>
               <w:jc w:val="left"/>
             </w:pPr>
@@ -9332,7 +9277,6 @@
           </w:tcPr>
           <w:p>
             <w:pPr>
-              <w:keepNext/>
               <w:spacing w:after="0"/>
               <w:jc w:val="left"/>
             </w:pPr>
@@ -9350,7 +9294,6 @@
           </w:tcPr>
           <w:p>
             <w:pPr>
-              <w:keepNext/>
               <w:spacing w:after="0"/>
               <w:jc w:val="left"/>
             </w:pPr>
@@ -9370,7 +9313,6 @@
           </w:tcPr>
           <w:p>
             <w:pPr>
-              <w:keepNext/>
               <w:spacing w:after="0"/>
               <w:jc w:val="left"/>
             </w:pPr>
@@ -9388,7 +9330,6 @@
           </w:tcPr>
           <w:p>
             <w:pPr>
-              <w:keepNext/>
               <w:spacing w:after="0"/>
               <w:jc w:val="left"/>
             </w:pPr>
@@ -9413,7 +9354,6 @@
           </w:tcPr>
           <w:p>
             <w:pPr>
-              <w:keepNext/>
               <w:spacing w:after="0"/>
               <w:jc w:val="left"/>
             </w:pPr>
@@ -9431,7 +9371,6 @@
           </w:tcPr>
           <w:p>
             <w:pPr>
-              <w:keepNext/>
               <w:spacing w:after="0"/>
               <w:jc w:val="left"/>
             </w:pPr>
@@ -9449,7 +9388,6 @@
           </w:tcPr>
           <w:p>
             <w:pPr>
-              <w:keepNext/>
               <w:spacing w:after="0"/>
               <w:jc w:val="left"/>
             </w:pPr>
@@ -9469,7 +9407,6 @@
           </w:tcPr>
           <w:p>
             <w:pPr>
-              <w:keepNext/>
               <w:spacing w:after="0"/>
               <w:jc w:val="left"/>
             </w:pPr>
@@ -9487,7 +9424,6 @@
           </w:tcPr>
           <w:p>
             <w:pPr>
-              <w:keepNext/>
               <w:spacing w:after="0"/>
               <w:jc w:val="left"/>
             </w:pPr>
@@ -9719,6 +9655,7 @@
       <w:tblPr>
         <w:tblStyle w:val="Tablaconcuadrcula"/>
         <w:tblW w:w="0" w:type="auto"/>
+        <w:jc w:val="center"/>
         <w:tblLayout w:type="fixed"/>
         <w:tblLook w:val="04A0" w:firstRow="1" w:lastRow="0" w:firstColumn="1" w:lastColumn="0" w:noHBand="0" w:noVBand="1"/>
       </w:tblPr>
@@ -9866,7 +9803,6 @@
           </w:tcPr>
           <w:p>
             <w:pPr>
-              <w:keepNext/>
               <w:spacing w:after="0"/>
               <w:jc w:val="left"/>
             </w:pPr>
@@ -9884,7 +9820,6 @@
           </w:tcPr>
           <w:p>
             <w:pPr>
-              <w:keepNext/>
               <w:spacing w:after="0"/>
               <w:jc w:val="left"/>
             </w:pPr>
@@ -9902,7 +9837,6 @@
           </w:tcPr>
           <w:p>
             <w:pPr>
-              <w:keepNext/>
               <w:spacing w:after="0"/>
               <w:jc w:val="left"/>
             </w:pPr>
@@ -9920,7 +9854,6 @@
           </w:tcPr>
           <w:p>
             <w:pPr>
-              <w:keepNext/>
               <w:spacing w:after="0"/>
               <w:jc w:val="left"/>
             </w:pPr>
@@ -9940,7 +9873,6 @@
           </w:tcPr>
           <w:p>
             <w:pPr>
-              <w:keepNext/>
               <w:spacing w:after="0"/>
               <w:jc w:val="left"/>
             </w:pPr>
@@ -9960,7 +9892,6 @@
           </w:tcPr>
           <w:p>
             <w:pPr>
-              <w:keepNext/>
               <w:spacing w:after="0"/>
               <w:jc w:val="left"/>
             </w:pPr>
@@ -9985,7 +9916,6 @@
           </w:tcPr>
           <w:p>
             <w:pPr>
-              <w:keepNext/>
               <w:spacing w:after="0"/>
               <w:jc w:val="left"/>
             </w:pPr>
@@ -10003,7 +9933,6 @@
           </w:tcPr>
           <w:p>
             <w:pPr>
-              <w:keepNext/>
               <w:spacing w:after="0"/>
               <w:jc w:val="left"/>
             </w:pPr>
@@ -10021,7 +9950,6 @@
           </w:tcPr>
           <w:p>
             <w:pPr>
-              <w:keepNext/>
               <w:spacing w:after="0"/>
               <w:jc w:val="left"/>
             </w:pPr>
@@ -10039,7 +9967,6 @@
           </w:tcPr>
           <w:p>
             <w:pPr>
-              <w:keepNext/>
               <w:spacing w:after="0"/>
               <w:jc w:val="left"/>
             </w:pPr>
@@ -10059,7 +9986,6 @@
           </w:tcPr>
           <w:p>
             <w:pPr>
-              <w:keepNext/>
               <w:spacing w:after="0"/>
               <w:jc w:val="left"/>
             </w:pPr>
@@ -10079,7 +10005,6 @@
           </w:tcPr>
           <w:p>
             <w:pPr>
-              <w:keepNext/>
               <w:spacing w:after="0"/>
               <w:jc w:val="left"/>
             </w:pPr>
@@ -10104,7 +10029,6 @@
           </w:tcPr>
           <w:p>
             <w:pPr>
-              <w:keepNext/>
               <w:spacing w:after="0"/>
               <w:jc w:val="left"/>
             </w:pPr>
@@ -10122,7 +10046,6 @@
           </w:tcPr>
           <w:p>
             <w:pPr>
-              <w:keepNext/>
               <w:spacing w:after="0"/>
               <w:jc w:val="left"/>
             </w:pPr>
@@ -10140,7 +10063,6 @@
           </w:tcPr>
           <w:p>
             <w:pPr>
-              <w:keepNext/>
               <w:spacing w:after="0"/>
               <w:jc w:val="left"/>
             </w:pPr>
@@ -10158,7 +10080,6 @@
           </w:tcPr>
           <w:p>
             <w:pPr>
-              <w:keepNext/>
               <w:spacing w:after="0"/>
               <w:jc w:val="left"/>
             </w:pPr>
@@ -10178,7 +10099,6 @@
           </w:tcPr>
           <w:p>
             <w:pPr>
-              <w:keepNext/>
               <w:spacing w:after="0"/>
               <w:jc w:val="left"/>
             </w:pPr>
@@ -10198,7 +10118,6 @@
           </w:tcPr>
           <w:p>
             <w:pPr>
-              <w:keepNext/>
               <w:spacing w:after="0"/>
               <w:jc w:val="left"/>
             </w:pPr>
@@ -10490,7 +10409,6 @@
     </w:p>
     <w:p>
       <w:pPr>
-        <w:keepNext/>
         <w:spacing w:after="120"/>
       </w:pPr>
       <w:r>
@@ -10505,6 +10423,7 @@
       <w:tblPr>
         <w:tblStyle w:val="Tablaconcuadrcula"/>
         <w:tblW w:w="0" w:type="auto"/>
+        <w:jc w:val="center"/>
         <w:tblLayout w:type="fixed"/>
         <w:tblLook w:val="04A0" w:firstRow="1" w:lastRow="0" w:firstColumn="1" w:lastColumn="0" w:noHBand="0" w:noVBand="1"/>
       </w:tblPr>
@@ -11082,6 +11001,7 @@
     <w:p>
       <w:pPr>
         <w:pStyle w:val="Ttulo1"/>
+        <w:pageBreakBefore/>
       </w:pPr>
       <w:bookmarkStart w:id="19" w:name="_Toc241501390"/>
       <w:r>
@@ -11135,7 +11055,6 @@
     </w:p>
     <w:p>
       <w:pPr>
-        <w:keepNext/>
         <w:spacing w:after="120"/>
         <w:jc w:val="both"/>
       </w:pPr>
@@ -11151,6 +11070,7 @@
       <w:tblPr>
         <w:tblStyle w:val="Tablaconcuadrcula"/>
         <w:tblW w:w="0" w:type="auto"/>
+        <w:jc w:val="center"/>
         <w:tblLayout w:type="fixed"/>
         <w:tblLook w:val="04A0" w:firstRow="1" w:lastRow="0" w:firstColumn="1" w:lastColumn="0" w:noHBand="0" w:noVBand="1"/>
       </w:tblPr>
@@ -11236,7 +11156,6 @@
           </w:tcPr>
           <w:p>
             <w:pPr>
-              <w:keepNext/>
               <w:jc w:val="left"/>
             </w:pPr>
             <w:r>
@@ -11261,7 +11180,6 @@
           </w:tcPr>
           <w:p>
             <w:pPr>
-              <w:keepNext/>
               <w:jc w:val="left"/>
             </w:pPr>
             <w:r>
@@ -11286,7 +11204,6 @@
           </w:tcPr>
           <w:p>
             <w:pPr>
-              <w:keepNext/>
               <w:jc w:val="left"/>
             </w:pPr>
             <w:r>
@@ -11496,6 +11413,7 @@
       <w:tblPr>
         <w:tblStyle w:val="Tablaconcuadrcula"/>
         <w:tblW w:w="0" w:type="auto"/>
+        <w:jc w:val="center"/>
         <w:tblLayout w:type="fixed"/>
         <w:tblLook w:val="04A0" w:firstRow="1" w:lastRow="0" w:firstColumn="1" w:lastColumn="0" w:noHBand="0" w:noVBand="1"/>
       </w:tblPr>
@@ -11653,7 +11571,6 @@
           </w:tcPr>
           <w:p>
             <w:pPr>
-              <w:keepNext/>
               <w:jc w:val="left"/>
             </w:pPr>
             <w:r>
@@ -11678,7 +11595,6 @@
           </w:tcPr>
           <w:p>
             <w:pPr>
-              <w:keepNext/>
               <w:jc w:val="left"/>
             </w:pPr>
             <w:r>
@@ -11703,7 +11619,6 @@
           </w:tcPr>
           <w:p>
             <w:pPr>
-              <w:keepNext/>
               <w:jc w:val="left"/>
             </w:pPr>
             <w:r>
@@ -11728,7 +11643,6 @@
           </w:tcPr>
           <w:p>
             <w:pPr>
-              <w:keepNext/>
               <w:jc w:val="left"/>
             </w:pPr>
             <w:r>
@@ -11753,7 +11667,6 @@
           </w:tcPr>
           <w:p>
             <w:pPr>
-              <w:keepNext/>
               <w:jc w:val="left"/>
             </w:pPr>
             <w:r>
@@ -11778,7 +11691,6 @@
           </w:tcPr>
           <w:p>
             <w:pPr>
-              <w:keepNext/>
               <w:jc w:val="left"/>
             </w:pPr>
             <w:r>
@@ -11808,7 +11720,6 @@
           </w:tcPr>
           <w:p>
             <w:pPr>
-              <w:keepNext/>
               <w:jc w:val="left"/>
             </w:pPr>
             <w:r>
@@ -11833,7 +11744,6 @@
           </w:tcPr>
           <w:p>
             <w:pPr>
-              <w:keepNext/>
               <w:jc w:val="left"/>
             </w:pPr>
             <w:r>
@@ -11858,7 +11768,6 @@
           </w:tcPr>
           <w:p>
             <w:pPr>
-              <w:keepNext/>
               <w:jc w:val="left"/>
             </w:pPr>
             <w:r>
@@ -11883,7 +11792,6 @@
           </w:tcPr>
           <w:p>
             <w:pPr>
-              <w:keepNext/>
               <w:jc w:val="left"/>
             </w:pPr>
             <w:r>
@@ -11901,7 +11809,6 @@
           </w:tcPr>
           <w:p>
             <w:pPr>
-              <w:keepNext/>
               <w:jc w:val="left"/>
             </w:pPr>
             <w:r>
@@ -11926,7 +11833,6 @@
           </w:tcPr>
           <w:p>
             <w:pPr>
-              <w:keepNext/>
               <w:jc w:val="left"/>
             </w:pPr>
             <w:r>
@@ -12257,7 +12163,7 @@
       <w:r>
         <w:drawing>
           <wp:inline xmlns:a="http://schemas.openxmlformats.org/drawingml/2006/main" xmlns:pic="http://schemas.openxmlformats.org/drawingml/2006/picture">
-            <wp:extent cx="5852160" cy="2482973"/>
+            <wp:extent cx="5486400" cy="2327787"/>
             <wp:docPr id="1460843491" name="Picture 1460843491"/>
             <wp:cNvGraphicFramePr>
               <a:graphicFrameLocks noChangeAspect="1"/>
@@ -12278,7 +12184,7 @@
                   <pic:spPr>
                     <a:xfrm>
                       <a:off x="0" y="0"/>
-                      <a:ext cx="5852160" cy="2482973"/>
+                      <a:ext cx="5486400" cy="2327787"/>
                     </a:xfrm>
                     <a:prstGeom prst="rect"/>
                   </pic:spPr>
@@ -12314,7 +12220,6 @@
     </w:p>
     <w:p>
       <w:pPr>
-        <w:keepNext/>
         <w:spacing w:after="120"/>
         <w:jc w:val="both"/>
       </w:pPr>
@@ -12330,6 +12235,7 @@
       <w:tblPr>
         <w:tblStyle w:val="Tablaconcuadrcula"/>
         <w:tblW w:w="0" w:type="auto"/>
+        <w:jc w:val="center"/>
         <w:tblLayout w:type="fixed"/>
         <w:tblLook w:val="04A0" w:firstRow="1" w:lastRow="0" w:firstColumn="1" w:lastColumn="0" w:noHBand="0" w:noVBand="1"/>
       </w:tblPr>
@@ -12436,7 +12342,6 @@
           </w:tcPr>
           <w:p>
             <w:pPr>
-              <w:keepNext/>
               <w:jc w:val="left"/>
             </w:pPr>
             <w:r>
@@ -12461,7 +12366,6 @@
           </w:tcPr>
           <w:p>
             <w:pPr>
-              <w:keepNext/>
               <w:jc w:val="left"/>
             </w:pPr>
             <w:r>
@@ -12486,7 +12390,6 @@
           </w:tcPr>
           <w:p>
             <w:pPr>
-              <w:keepNext/>
               <w:jc w:val="left"/>
             </w:pPr>
             <w:r>
@@ -12511,7 +12414,6 @@
           </w:tcPr>
           <w:p>
             <w:pPr>
-              <w:keepNext/>
               <w:jc w:val="left"/>
             </w:pPr>
             <w:r>
@@ -12541,7 +12443,6 @@
           </w:tcPr>
           <w:p>
             <w:pPr>
-              <w:keepNext/>
               <w:jc w:val="left"/>
             </w:pPr>
             <w:r>
@@ -12566,7 +12467,6 @@
           </w:tcPr>
           <w:p>
             <w:pPr>
-              <w:keepNext/>
               <w:jc w:val="left"/>
             </w:pPr>
             <w:r>
@@ -12591,7 +12491,6 @@
           </w:tcPr>
           <w:p>
             <w:pPr>
-              <w:keepNext/>
               <w:jc w:val="left"/>
             </w:pPr>
             <w:r>
@@ -12616,7 +12515,6 @@
           </w:tcPr>
           <w:p>
             <w:pPr>
-              <w:keepNext/>
               <w:jc w:val="left"/>
             </w:pPr>
             <w:r>
@@ -12863,6 +12761,7 @@
     <w:p>
       <w:pPr>
         <w:pStyle w:val="Ttulo1"/>
+        <w:pageBreakBefore/>
       </w:pPr>
       <w:bookmarkStart w:id="23" w:name="_Toc241501394"/>
       <w:r>
@@ -12918,7 +12817,6 @@
     </w:p>
     <w:p>
       <w:pPr>
-        <w:keepNext/>
         <w:spacing w:after="120"/>
         <w:jc w:val="both"/>
       </w:pPr>
@@ -12934,6 +12832,7 @@
       <w:tblPr>
         <w:tblStyle w:val="Tablaconcuadrcula"/>
         <w:tblW w:w="0" w:type="auto"/>
+        <w:jc w:val="center"/>
         <w:tblLayout w:type="fixed"/>
         <w:tblLook w:val="04A0" w:firstRow="1" w:lastRow="0" w:firstColumn="1" w:lastColumn="0" w:noHBand="0" w:noVBand="1"/>
       </w:tblPr>
@@ -13546,6 +13445,7 @@
           </w:tcPr>
           <w:p>
             <w:pPr>
+              <w:keepNext/>
               <w:jc w:val="left"/>
             </w:pPr>
             <w:r>
@@ -13570,6 +13470,7 @@
           </w:tcPr>
           <w:p>
             <w:pPr>
+              <w:keepNext/>
               <w:jc w:val="left"/>
             </w:pPr>
             <w:r>
@@ -13594,6 +13495,7 @@
           </w:tcPr>
           <w:p>
             <w:pPr>
+              <w:keepNext/>
               <w:jc w:val="left"/>
             </w:pPr>
             <w:r>
@@ -13618,6 +13520,7 @@
           </w:tcPr>
           <w:p>
             <w:pPr>
+              <w:keepNext/>
               <w:jc w:val="left"/>
             </w:pPr>
             <w:r>
@@ -13767,7 +13670,7 @@
       <w:r>
         <w:drawing>
           <wp:inline xmlns:a="http://schemas.openxmlformats.org/drawingml/2006/main" xmlns:pic="http://schemas.openxmlformats.org/drawingml/2006/picture">
-            <wp:extent cx="5897880" cy="2924375"/>
+            <wp:extent cx="5486400" cy="2720348"/>
             <wp:docPr id="1460843490" name="Picture 1460843490"/>
             <wp:cNvGraphicFramePr>
               <a:graphicFrameLocks noChangeAspect="1"/>
@@ -13788,7 +13691,7 @@
                   <pic:spPr>
                     <a:xfrm>
                       <a:off x="0" y="0"/>
-                      <a:ext cx="5897880" cy="2924375"/>
+                      <a:ext cx="5486400" cy="2720348"/>
                     </a:xfrm>
                     <a:prstGeom prst="rect"/>
                   </pic:spPr>
@@ -13825,7 +13728,6 @@
     </w:p>
     <w:p>
       <w:pPr>
-        <w:keepNext/>
         <w:jc w:val="both"/>
       </w:pPr>
       <w:r>
@@ -13840,6 +13742,7 @@
       <w:tblPr>
         <w:tblStyle w:val="Tablaconcuadrcula"/>
         <w:tblW w:w="0" w:type="auto"/>
+        <w:jc w:val="center"/>
         <w:tblLayout w:type="fixed"/>
         <w:tblLook w:val="04A0" w:firstRow="1" w:lastRow="0" w:firstColumn="1" w:lastColumn="0" w:noHBand="0" w:noVBand="1"/>
       </w:tblPr>
@@ -14225,7 +14128,7 @@
       <w:r>
         <w:drawing>
           <wp:inline xmlns:a="http://schemas.openxmlformats.org/drawingml/2006/main" xmlns:pic="http://schemas.openxmlformats.org/drawingml/2006/picture">
-            <wp:extent cx="5897880" cy="1881361"/>
+            <wp:extent cx="5486400" cy="1750103"/>
             <wp:docPr id="1460843492" name="Picture 1460843492"/>
             <wp:cNvGraphicFramePr>
               <a:graphicFrameLocks noChangeAspect="1"/>
@@ -14246,7 +14149,7 @@
                   <pic:spPr>
                     <a:xfrm>
                       <a:off x="0" y="0"/>
-                      <a:ext cx="5897880" cy="1881361"/>
+                      <a:ext cx="5486400" cy="1750103"/>
                     </a:xfrm>
                     <a:prstGeom prst="rect"/>
                   </pic:spPr>
@@ -14282,7 +14185,6 @@
     </w:p>
     <w:p>
       <w:pPr>
-        <w:keepNext/>
         <w:spacing w:after="120"/>
         <w:jc w:val="both"/>
       </w:pPr>
@@ -14298,6 +14200,7 @@
       <w:tblPr>
         <w:tblStyle w:val="Tablaconcuadrcula"/>
         <w:tblW w:w="0" w:type="auto"/>
+        <w:jc w:val="center"/>
         <w:tblLayout w:type="fixed"/>
         <w:tblLook w:val="04A0" w:firstRow="1" w:lastRow="0" w:firstColumn="1" w:lastColumn="0" w:noHBand="0" w:noVBand="1"/>
       </w:tblPr>
@@ -14697,7 +14600,7 @@
       <w:r>
         <w:drawing>
           <wp:inline xmlns:a="http://schemas.openxmlformats.org/drawingml/2006/main" xmlns:pic="http://schemas.openxmlformats.org/drawingml/2006/picture">
-            <wp:extent cx="5897880" cy="2165192"/>
+            <wp:extent cx="5486400" cy="2014132"/>
             <wp:docPr id="1460843493" name="Picture 1460843493"/>
             <wp:cNvGraphicFramePr>
               <a:graphicFrameLocks noChangeAspect="1"/>
@@ -14718,7 +14621,7 @@
                   <pic:spPr>
                     <a:xfrm>
                       <a:off x="0" y="0"/>
-                      <a:ext cx="5897880" cy="2165192"/>
+                      <a:ext cx="5486400" cy="2014132"/>
                     </a:xfrm>
                     <a:prstGeom prst="rect"/>
                   </pic:spPr>
@@ -14745,6 +14648,7 @@
     <w:p>
       <w:pPr>
         <w:pStyle w:val="Ttulo1"/>
+        <w:pageBreakBefore/>
       </w:pPr>
       <w:bookmarkStart w:id="27" w:name="_Toc241501398"/>
       <w:r>
@@ -14778,6 +14682,7 @@
       <w:tblPr>
         <w:tblStyle w:val="Tablaconcuadrcula"/>
         <w:tblW w:w="0" w:type="auto"/>
+        <w:jc w:val="center"/>
         <w:tblLayout w:type="fixed"/>
         <w:tblLook w:val="04A0" w:firstRow="1" w:lastRow="0" w:firstColumn="1" w:lastColumn="0" w:noHBand="0" w:noVBand="1"/>
       </w:tblPr>
@@ -14862,7 +14767,6 @@
           </w:tcPr>
           <w:p>
             <w:pPr>
-              <w:keepNext/>
               <w:spacing w:after="0"/>
               <w:jc w:val="left"/>
             </w:pPr>
@@ -14880,7 +14784,6 @@
           </w:tcPr>
           <w:p>
             <w:pPr>
-              <w:keepNext/>
               <w:spacing w:after="0"/>
               <w:jc w:val="left"/>
               <w:rPr>
@@ -14904,7 +14807,6 @@
           </w:tcPr>
           <w:p>
             <w:pPr>
-              <w:keepNext/>
               <w:spacing w:after="0"/>
               <w:jc w:val="left"/>
               <w:rPr>
@@ -14949,7 +14851,6 @@
           </w:tcPr>
           <w:p>
             <w:pPr>
-              <w:keepNext/>
               <w:spacing w:after="0"/>
               <w:jc w:val="left"/>
             </w:pPr>
@@ -14967,7 +14868,6 @@
           </w:tcPr>
           <w:p>
             <w:pPr>
-              <w:keepNext/>
               <w:spacing w:after="0"/>
               <w:jc w:val="left"/>
               <w:rPr>
@@ -15007,7 +14907,6 @@
           </w:tcPr>
           <w:p>
             <w:pPr>
-              <w:keepNext/>
               <w:spacing w:after="0"/>
               <w:jc w:val="left"/>
               <w:rPr>
@@ -15052,7 +14951,6 @@
           </w:tcPr>
           <w:p>
             <w:pPr>
-              <w:keepNext/>
               <w:spacing w:after="0"/>
               <w:jc w:val="left"/>
             </w:pPr>
@@ -15070,7 +14968,6 @@
           </w:tcPr>
           <w:p>
             <w:pPr>
-              <w:keepNext/>
               <w:spacing w:after="0"/>
               <w:jc w:val="left"/>
               <w:rPr>
@@ -15094,7 +14991,6 @@
           </w:tcPr>
           <w:p>
             <w:pPr>
-              <w:keepNext/>
               <w:spacing w:after="0"/>
               <w:jc w:val="left"/>
               <w:rPr>
@@ -15123,7 +15019,6 @@
           </w:tcPr>
           <w:p>
             <w:pPr>
-              <w:keepNext/>
               <w:spacing w:after="0"/>
               <w:jc w:val="left"/>
             </w:pPr>
@@ -15141,7 +15036,6 @@
           </w:tcPr>
           <w:p>
             <w:pPr>
-              <w:keepNext/>
               <w:spacing w:after="0"/>
               <w:jc w:val="left"/>
               <w:rPr>
@@ -15165,7 +15059,6 @@
           </w:tcPr>
           <w:p>
             <w:pPr>
-              <w:keepNext/>
               <w:spacing w:after="0"/>
               <w:jc w:val="left"/>
               <w:rPr>
@@ -15446,6 +15339,7 @@
     <w:p>
       <w:pPr>
         <w:pStyle w:val="Ttulo1"/>
+        <w:pageBreakBefore/>
       </w:pPr>
       <w:bookmarkStart w:id="28" w:name="_Toc241501399"/>
       <w:r>
@@ -15479,6 +15373,7 @@
       <w:tblPr>
         <w:tblStyle w:val="Tablaconcuadrcula"/>
         <w:tblW w:w="9360" w:type="dxa"/>
+        <w:jc w:val="center"/>
         <w:tblLayout w:type="fixed"/>
         <w:tblLook w:val="04A0" w:firstRow="1" w:lastRow="0" w:firstColumn="1" w:lastColumn="0" w:noHBand="0" w:noVBand="1"/>
       </w:tblPr>
@@ -15542,7 +15437,6 @@
           </w:tcPr>
           <w:p>
             <w:pPr>
-              <w:keepNext/>
               <w:spacing w:after="0"/>
               <w:jc w:val="left"/>
               <w:rPr>
@@ -15564,7 +15458,6 @@
           </w:tcPr>
           <w:p>
             <w:pPr>
-              <w:keepNext/>
               <w:spacing w:after="0"/>
               <w:jc w:val="left"/>
               <w:rPr>
@@ -15593,7 +15486,6 @@
           </w:tcPr>
           <w:p>
             <w:pPr>
-              <w:keepNext/>
               <w:spacing w:after="0"/>
               <w:jc w:val="left"/>
               <w:rPr>
@@ -15615,7 +15507,6 @@
           </w:tcPr>
           <w:p>
             <w:pPr>
-              <w:keepNext/>
               <w:spacing w:after="0"/>
               <w:jc w:val="left"/>
               <w:rPr>
@@ -15644,7 +15535,6 @@
           </w:tcPr>
           <w:p>
             <w:pPr>
-              <w:keepNext/>
               <w:spacing w:after="0"/>
               <w:jc w:val="left"/>
               <w:rPr>
@@ -15666,7 +15556,6 @@
           </w:tcPr>
           <w:p>
             <w:pPr>
-              <w:keepNext/>
               <w:spacing w:after="0"/>
               <w:jc w:val="left"/>
               <w:rPr>
@@ -15695,7 +15584,6 @@
           </w:tcPr>
           <w:p>
             <w:pPr>
-              <w:keepNext/>
               <w:spacing w:after="0"/>
               <w:jc w:val="left"/>
               <w:rPr>
@@ -15717,7 +15605,6 @@
           </w:tcPr>
           <w:p>
             <w:pPr>
-              <w:keepNext/>
               <w:spacing w:after="0"/>
               <w:jc w:val="left"/>
               <w:rPr>
@@ -15962,6 +15849,7 @@
     <w:p>
       <w:pPr>
         <w:pStyle w:val="Ttulo1"/>
+        <w:pageBreakBefore/>
       </w:pPr>
       <w:bookmarkStart w:id="29" w:name="_Toc241501400"/>
       <w:r>
@@ -15994,6 +15882,7 @@
       <w:tblPr>
         <w:tblStyle w:val="Tablaconcuadrcula"/>
         <w:tblW w:w="0" w:type="auto"/>
+        <w:jc w:val="center"/>
         <w:tblLayout w:type="fixed"/>
         <w:tblLook w:val="04A0" w:firstRow="1" w:lastRow="0" w:firstColumn="1" w:lastColumn="0" w:noHBand="0" w:noVBand="1"/>
       </w:tblPr>
@@ -16087,7 +15976,6 @@
           </w:tcPr>
           <w:p>
             <w:pPr>
-              <w:keepNext/>
               <w:spacing w:after="0"/>
               <w:jc w:val="left"/>
             </w:pPr>
@@ -16105,7 +15993,6 @@
           </w:tcPr>
           <w:p>
             <w:pPr>
-              <w:keepNext/>
               <w:spacing w:after="0"/>
               <w:jc w:val="left"/>
               <w:rPr>
@@ -16127,7 +16014,6 @@
           </w:tcPr>
           <w:p>
             <w:pPr>
-              <w:keepNext/>
               <w:spacing w:after="0"/>
               <w:jc w:val="left"/>
               <w:rPr>
@@ -16154,7 +16040,6 @@
           </w:tcPr>
           <w:p>
             <w:pPr>
-              <w:keepNext/>
               <w:spacing w:after="0"/>
               <w:jc w:val="left"/>
             </w:pPr>
@@ -16172,7 +16057,6 @@
           </w:tcPr>
           <w:p>
             <w:pPr>
-              <w:keepNext/>
               <w:spacing w:after="0"/>
               <w:jc w:val="left"/>
               <w:rPr>
@@ -16194,7 +16078,6 @@
           </w:tcPr>
           <w:p>
             <w:pPr>
-              <w:keepNext/>
               <w:spacing w:after="0"/>
               <w:jc w:val="left"/>
               <w:rPr>
@@ -16221,7 +16104,6 @@
           </w:tcPr>
           <w:p>
             <w:pPr>
-              <w:keepNext/>
               <w:spacing w:after="0"/>
               <w:jc w:val="left"/>
             </w:pPr>
@@ -16239,7 +16121,6 @@
           </w:tcPr>
           <w:p>
             <w:pPr>
-              <w:keepNext/>
               <w:spacing w:after="0"/>
               <w:jc w:val="left"/>
               <w:rPr>
@@ -16275,7 +16156,6 @@
           </w:tcPr>
           <w:p>
             <w:pPr>
-              <w:keepNext/>
               <w:spacing w:after="0"/>
               <w:jc w:val="left"/>
               <w:rPr>
@@ -16445,6 +16325,7 @@
       <w:tblPr>
         <w:tblStyle w:val="Tablaconcuadrcula"/>
         <w:tblW w:w="0" w:type="auto"/>
+        <w:jc w:val="center"/>
         <w:tblLayout w:type="fixed"/>
         <w:tblLook w:val="04A0" w:firstRow="1" w:lastRow="0" w:firstColumn="1" w:lastColumn="0" w:noHBand="0" w:noVBand="1"/>
       </w:tblPr>
@@ -17144,6 +17025,7 @@
     <w:p>
       <w:pPr>
         <w:pStyle w:val="Ttulo1"/>
+        <w:pageBreakBefore/>
       </w:pPr>
       <w:bookmarkStart w:id="30" w:name="_Toc241501401"/>
       <w:r>
@@ -17197,6 +17079,7 @@
       <w:tblPr>
         <w:tblStyle w:val="Tablaconcuadrcula"/>
         <w:tblW w:w="0" w:type="auto"/>
+        <w:jc w:val="center"/>
         <w:tblLayout w:type="fixed"/>
         <w:tblLook w:val="04A0" w:firstRow="1" w:lastRow="0" w:firstColumn="1" w:lastColumn="0" w:noHBand="0" w:noVBand="1"/>
       </w:tblPr>
@@ -17324,7 +17207,6 @@
           </w:tcPr>
           <w:p>
             <w:pPr>
-              <w:keepNext/>
               <w:jc w:val="left"/>
             </w:pPr>
             <w:r>
@@ -17349,7 +17231,6 @@
           </w:tcPr>
           <w:p>
             <w:pPr>
-              <w:keepNext/>
               <w:jc w:val="left"/>
             </w:pPr>
             <w:r>
@@ -17374,7 +17255,6 @@
           </w:tcPr>
           <w:p>
             <w:pPr>
-              <w:keepNext/>
               <w:jc w:val="left"/>
             </w:pPr>
             <w:r>
@@ -17399,7 +17279,6 @@
           </w:tcPr>
           <w:p>
             <w:pPr>
-              <w:keepNext/>
               <w:jc w:val="left"/>
             </w:pPr>
             <w:r>
@@ -17417,7 +17296,6 @@
           </w:tcPr>
           <w:p>
             <w:pPr>
-              <w:keepNext/>
               <w:jc w:val="left"/>
             </w:pPr>
             <w:r>
@@ -17440,7 +17318,6 @@
           </w:tcPr>
           <w:p>
             <w:pPr>
-              <w:keepNext/>
               <w:jc w:val="left"/>
             </w:pPr>
             <w:r>
@@ -17465,7 +17342,6 @@
           </w:tcPr>
           <w:p>
             <w:pPr>
-              <w:keepNext/>
               <w:jc w:val="left"/>
             </w:pPr>
             <w:r>
@@ -17490,7 +17366,6 @@
           </w:tcPr>
           <w:p>
             <w:pPr>
-              <w:keepNext/>
               <w:jc w:val="left"/>
             </w:pPr>
             <w:r>
@@ -17515,7 +17390,6 @@
           </w:tcPr>
           <w:p>
             <w:pPr>
-              <w:keepNext/>
               <w:jc w:val="left"/>
             </w:pPr>
             <w:r>
@@ -17540,7 +17414,6 @@
           </w:tcPr>
           <w:p>
             <w:pPr>
-              <w:keepNext/>
               <w:jc w:val="left"/>
             </w:pPr>
             <w:r>
@@ -17570,7 +17443,6 @@
           </w:tcPr>
           <w:p>
             <w:pPr>
-              <w:keepNext/>
               <w:jc w:val="left"/>
             </w:pPr>
             <w:r>
@@ -17595,7 +17467,6 @@
           </w:tcPr>
           <w:p>
             <w:pPr>
-              <w:keepNext/>
               <w:jc w:val="left"/>
             </w:pPr>
             <w:r>
@@ -17620,7 +17491,6 @@
           </w:tcPr>
           <w:p>
             <w:pPr>
-              <w:keepNext/>
               <w:jc w:val="left"/>
             </w:pPr>
             <w:r>
@@ -17645,7 +17515,6 @@
           </w:tcPr>
           <w:p>
             <w:pPr>
-              <w:keepNext/>
               <w:jc w:val="left"/>
             </w:pPr>
             <w:r>
@@ -17670,7 +17539,6 @@
           </w:tcPr>
           <w:p>
             <w:pPr>
-              <w:keepNext/>
               <w:jc w:val="left"/>
             </w:pPr>
             <w:r>
@@ -17700,7 +17568,6 @@
           </w:tcPr>
           <w:p>
             <w:pPr>
-              <w:keepNext/>
               <w:jc w:val="left"/>
             </w:pPr>
             <w:r>
@@ -17725,7 +17592,6 @@
           </w:tcPr>
           <w:p>
             <w:pPr>
-              <w:keepNext/>
               <w:jc w:val="left"/>
             </w:pPr>
             <w:r>
@@ -17750,7 +17616,6 @@
           </w:tcPr>
           <w:p>
             <w:pPr>
-              <w:keepNext/>
               <w:jc w:val="left"/>
             </w:pPr>
             <w:r>
@@ -17775,7 +17640,6 @@
           </w:tcPr>
           <w:p>
             <w:pPr>
-              <w:keepNext/>
               <w:jc w:val="left"/>
             </w:pPr>
             <w:r>
@@ -17800,7 +17664,6 @@
           </w:tcPr>
           <w:p>
             <w:pPr>
-              <w:keepNext/>
               <w:jc w:val="left"/>
             </w:pPr>
             <w:r>
@@ -18098,7 +17961,6 @@
     </w:p>
     <w:p>
       <w:pPr>
-        <w:keepNext/>
         <w:spacing w:after="120"/>
         <w:jc w:val="both"/>
       </w:pPr>
@@ -18110,6 +17972,7 @@
       <w:tblPr>
         <w:tblStyle w:val="Tablaconcuadrcula"/>
         <w:tblW w:w="0" w:type="auto"/>
+        <w:jc w:val="center"/>
         <w:tblLayout w:type="fixed"/>
         <w:tblLook w:val="04A0" w:firstRow="1" w:lastRow="0" w:firstColumn="1" w:lastColumn="0" w:noHBand="0" w:noVBand="1"/>
       </w:tblPr>
@@ -18216,7 +18079,6 @@
           </w:tcPr>
           <w:p>
             <w:pPr>
-              <w:keepNext/>
               <w:jc w:val="left"/>
             </w:pPr>
             <w:r>
@@ -18241,7 +18103,6 @@
           </w:tcPr>
           <w:p>
             <w:pPr>
-              <w:keepNext/>
               <w:jc w:val="left"/>
             </w:pPr>
             <w:r>
@@ -18266,7 +18127,6 @@
           </w:tcPr>
           <w:p>
             <w:pPr>
-              <w:keepNext/>
               <w:jc w:val="left"/>
             </w:pPr>
             <w:r>
@@ -18291,7 +18151,6 @@
           </w:tcPr>
           <w:p>
             <w:pPr>
-              <w:keepNext/>
               <w:jc w:val="left"/>
             </w:pPr>
             <w:r>
@@ -18321,7 +18180,6 @@
           </w:tcPr>
           <w:p>
             <w:pPr>
-              <w:keepNext/>
               <w:jc w:val="left"/>
             </w:pPr>
             <w:r>
@@ -18346,7 +18204,6 @@
           </w:tcPr>
           <w:p>
             <w:pPr>
-              <w:keepNext/>
               <w:jc w:val="left"/>
             </w:pPr>
             <w:r>
@@ -18371,7 +18228,6 @@
           </w:tcPr>
           <w:p>
             <w:pPr>
-              <w:keepNext/>
               <w:jc w:val="left"/>
             </w:pPr>
             <w:r>
@@ -18396,7 +18252,6 @@
           </w:tcPr>
           <w:p>
             <w:pPr>
-              <w:keepNext/>
               <w:jc w:val="left"/>
             </w:pPr>
             <w:r>
@@ -18426,7 +18281,6 @@
           </w:tcPr>
           <w:p>
             <w:pPr>
-              <w:keepNext/>
               <w:jc w:val="left"/>
             </w:pPr>
             <w:r>
@@ -18451,7 +18305,6 @@
           </w:tcPr>
           <w:p>
             <w:pPr>
-              <w:keepNext/>
               <w:jc w:val="left"/>
             </w:pPr>
             <w:r>
@@ -18476,7 +18329,6 @@
           </w:tcPr>
           <w:p>
             <w:pPr>
-              <w:keepNext/>
               <w:jc w:val="left"/>
             </w:pPr>
             <w:r>
@@ -18501,7 +18353,6 @@
           </w:tcPr>
           <w:p>
             <w:pPr>
-              <w:keepNext/>
               <w:jc w:val="left"/>
             </w:pPr>
             <w:r>
@@ -18531,7 +18382,6 @@
           </w:tcPr>
           <w:p>
             <w:pPr>
-              <w:keepNext/>
               <w:jc w:val="left"/>
             </w:pPr>
             <w:r>
@@ -18556,7 +18406,6 @@
           </w:tcPr>
           <w:p>
             <w:pPr>
-              <w:keepNext/>
               <w:jc w:val="left"/>
             </w:pPr>
             <w:r>
@@ -18581,7 +18430,6 @@
           </w:tcPr>
           <w:p>
             <w:pPr>
-              <w:keepNext/>
               <w:jc w:val="left"/>
             </w:pPr>
             <w:r>
@@ -18606,7 +18454,6 @@
           </w:tcPr>
           <w:p>
             <w:pPr>
-              <w:keepNext/>
               <w:jc w:val="left"/>
             </w:pPr>
             <w:r>
@@ -18846,6 +18693,7 @@
     <w:p>
       <w:pPr>
         <w:pStyle w:val="Ttulo1"/>
+        <w:pageBreakBefore/>
       </w:pPr>
       <w:bookmarkStart w:id="33" w:name="_Toc241501404"/>
       <w:r>
@@ -18903,6 +18751,7 @@
     <w:p>
       <w:pPr>
         <w:pStyle w:val="Ttulo1"/>
+        <w:pageBreakBefore/>
       </w:pPr>
       <w:bookmarkStart w:id="34" w:name="_Toc241501405"/>
       <w:r>
@@ -19132,6 +18981,7 @@
     <w:p>
       <w:pPr>
         <w:pStyle w:val="Ttulo1"/>
+        <w:pageBreakBefore/>
       </w:pPr>
       <w:bookmarkStart w:id="35" w:name="_Toc241501406"/>
       <w:r>
@@ -19164,6 +19014,7 @@
       <w:tblPr>
         <w:tblStyle w:val="Tablaconcuadrcula"/>
         <w:tblW w:w="0" w:type="auto"/>
+        <w:jc w:val="center"/>
         <w:tblLayout w:type="fixed"/>
         <w:tblLook w:val="04A0" w:firstRow="1" w:lastRow="0" w:firstColumn="1" w:lastColumn="0" w:noHBand="0" w:noVBand="1"/>
       </w:tblPr>
@@ -19248,7 +19099,6 @@
           </w:tcPr>
           <w:p>
             <w:pPr>
-              <w:keepNext/>
               <w:spacing w:after="0"/>
               <w:jc w:val="left"/>
             </w:pPr>
@@ -19266,7 +19116,6 @@
           </w:tcPr>
           <w:p>
             <w:pPr>
-              <w:keepNext/>
               <w:spacing w:after="0"/>
               <w:jc w:val="left"/>
             </w:pPr>
@@ -19284,7 +19133,6 @@
           </w:tcPr>
           <w:p>
             <w:pPr>
-              <w:keepNext/>
               <w:spacing w:after="0"/>
               <w:jc w:val="left"/>
             </w:pPr>
@@ -19307,7 +19155,6 @@
           </w:tcPr>
           <w:p>
             <w:pPr>
-              <w:keepNext/>
               <w:spacing w:after="0"/>
               <w:jc w:val="left"/>
             </w:pPr>
@@ -19325,7 +19172,6 @@
           </w:tcPr>
           <w:p>
             <w:pPr>
-              <w:keepNext/>
               <w:spacing w:after="0"/>
               <w:jc w:val="left"/>
             </w:pPr>
@@ -19343,7 +19189,6 @@
           </w:tcPr>
           <w:p>
             <w:pPr>
-              <w:keepNext/>
               <w:spacing w:after="0"/>
               <w:jc w:val="left"/>
             </w:pPr>
@@ -19380,7 +19225,6 @@
           </w:tcPr>
           <w:p>
             <w:pPr>
-              <w:keepNext/>
               <w:spacing w:after="0"/>
               <w:jc w:val="left"/>
             </w:pPr>
@@ -19398,7 +19242,6 @@
           </w:tcPr>
           <w:p>
             <w:pPr>
-              <w:keepNext/>
               <w:spacing w:after="0"/>
               <w:jc w:val="left"/>
             </w:pPr>
@@ -19416,7 +19259,6 @@
           </w:tcPr>
           <w:p>
             <w:pPr>
-              <w:keepNext/>
               <w:spacing w:after="0"/>
               <w:jc w:val="left"/>
             </w:pPr>
@@ -19439,7 +19281,6 @@
           </w:tcPr>
           <w:p>
             <w:pPr>
-              <w:keepNext/>
               <w:spacing w:after="0"/>
               <w:jc w:val="left"/>
             </w:pPr>
@@ -19457,7 +19298,6 @@
           </w:tcPr>
           <w:p>
             <w:pPr>
-              <w:keepNext/>
               <w:spacing w:after="0"/>
               <w:jc w:val="left"/>
             </w:pPr>
@@ -19475,7 +19315,6 @@
           </w:tcPr>
           <w:p>
             <w:pPr>
-              <w:keepNext/>
               <w:spacing w:after="0"/>
               <w:jc w:val="left"/>
             </w:pPr>
@@ -19498,7 +19337,6 @@
           </w:tcPr>
           <w:p>
             <w:pPr>
-              <w:keepNext/>
               <w:spacing w:after="0"/>
               <w:jc w:val="left"/>
             </w:pPr>
@@ -19516,7 +19354,6 @@
           </w:tcPr>
           <w:p>
             <w:pPr>
-              <w:keepNext/>
               <w:spacing w:after="0"/>
               <w:jc w:val="left"/>
             </w:pPr>
@@ -19534,7 +19371,6 @@
           </w:tcPr>
           <w:p>
             <w:pPr>
-              <w:keepNext/>
               <w:spacing w:after="0"/>
               <w:jc w:val="left"/>
             </w:pPr>
@@ -19557,7 +19393,6 @@
           </w:tcPr>
           <w:p>
             <w:pPr>
-              <w:keepNext/>
               <w:spacing w:after="0"/>
               <w:jc w:val="left"/>
             </w:pPr>
@@ -19575,7 +19410,6 @@
           </w:tcPr>
           <w:p>
             <w:pPr>
-              <w:keepNext/>
               <w:spacing w:after="0"/>
               <w:jc w:val="left"/>
             </w:pPr>
@@ -19593,7 +19427,6 @@
           </w:tcPr>
           <w:p>
             <w:pPr>
-              <w:keepNext/>
               <w:spacing w:after="0"/>
               <w:jc w:val="left"/>
             </w:pPr>

</xml_diff>